<commit_message>
docs(task #75): numeri finali della campagna in paper skeleton + PES_v1
- docs/paper/ChargeShield-FL_DSN2027_paper_skeleton.docx: Abstract/Table 2/
  NOTA/Limitations aggiornati da 8 a 10 configurazioni, p-value Wilcoxon reali
  (0.3125-1.0000) al posto del sign-test placeholder, ChargingIDS -> Byzantine
  Detector. Validato (office/validate.py PASSED) e verificato via rendering
  PDF (nessun overflow).
- docs/PrivacyExposureScore_v1.md: tabella PES_v1/v1.1 ricalcolata con
  scripts/compute_pes.py post-fix task #73 - 10 gruppi invece di 8, n=5
  corretto ovunque (prima il gruppo no-DP mostrava n=10 conflazionato con
  entity-split-sweep1).
</commit_message>
<xml_diff>
--- a/docs/paper/ChargeShield-FL_DSN2027_paper_skeleton.docx
+++ b/docs/paper/ChargeShield-FL_DSN2027_paper_skeleton.docx
@@ -82,7 +82,7 @@
           <w:i w:val="false"/>
           <w:iCs w:val="false"/>
         </w:rPr>
-        <w:t xml:space="preserve">Federated Learning (FL) is increasingly proposed for training shared models over critical infrastructure without centralizing raw data, but whether differential privacy (DP) applied at the FL communication channel actually prevents membership-inference leakage from the underlying computation remains an open empirical question. We present ChargeShield-FL, built around two domain-agnostic components — an event-driven ML Plane and a real-time Privacy Auditor — validated through a real electric-vehicle charging case study (ACN-Data, three real sites) using three DP placements and a Yeom/Shadow/LiRA attack hierarchy, in both simulation and a genuine multi-container NVFLARE/Containerlab deployment. Across every tested DP configuration, including no DP, we find no LiRA-detectable membership signal (composed AUC-ROC 0.4995–0.5005 across 8 configurations, 5 seeds each, all 95% bootstrap CIs containing 0.5). An extensive five-axis sanity check (training epochs, model capacity, feature informativeness, their combination, and training population) rules out an insensitive attack harness as the explanation. We report this null result, its statistical validation, and its implications for evaluating FL privacy claims in practice.</w:t>
+        <w:t xml:space="preserve">Federated Learning (FL) is increasingly proposed for training shared models over critical infrastructure without centralizing raw data, but whether differential privacy (DP) applied at the FL communication channel actually prevents membership-inference leakage from the underlying computation remains an open empirical question. We present ChargeShield-FL, built around two domain-agnostic components — an event-driven ML Plane and a real-time Privacy Auditor — validated through a real electric-vehicle charging case study (ACN-Data, three real sites) using three DP placements and a Yeom/Shadow/LiRA attack hierarchy, in both simulation and a genuine multi-container NVFLARE/Containerlab deployment. Across every tested DP configuration, including no DP, we find no LiRA-detectable membership signal (composed AUC-ROC 0.4995–0.5005 across 10 configurations, 5 seeds each, all 95% bootstrap CIs containing 0.5, confirmed with a real Wilcoxon signed-rank test). An extensive five-axis sanity check (training epochs, model capacity, feature informativeness, their combination, and training population) rules out an insensitive attack harness as the explanation. We report this null result, its statistical validation, and its implications for evaluating FL privacy claims in practice.</w:t>
       </w:r>
     </w:p>
     <w:p>
@@ -291,7 +291,7 @@
           <w:i w:val="false"/>
           <w:iCs w:val="false"/>
         </w:rPr>
-        <w:t xml:space="preserve">Byzantine-robust aggregation (Krum [9], and CUSUM/cosine-similarity variants) is used in our ChargingIDS defense layer, but — as we argue explicitly in §4 — belongs to a formally separate threat domain (client-side integrity, Scenario 2) from the privacy question this paper answers (server-side passive observation, Scenario 1); no integrity mechanism is claimed to mitigate MIA here, correcting a conflation we found and rejected during our own review process (see §4.3).</w:t>
+        <w:t xml:space="preserve">Byzantine-robust aggregation (Krum [9], and CUSUM/cosine-similarity variants) is used in our ByzantineDetector defense layer, but — as we argue explicitly in §4 — belongs to a formally separate threat domain (client-side integrity, Scenario 2) from the privacy question this paper answers (server-side passive observation, Scenario 1); no integrity mechanism is claimed to mitigate MIA here, correcting a conflation we found and rejected during our own review process (see §4.3).</w:t>
       </w:r>
     </w:p>
     <w:p>
@@ -387,22 +387,22 @@
         <w:spacing w:after="120" w:before="220"/>
       </w:pPr>
       <w:r>
-        <w:t xml:space="preserve">3.3 ChargingIDS: a formally separate integrity domain</w:t>
-      </w:r>
-    </w:p>
-    <w:p>
-      <w:pPr>
-        <w:spacing w:after="160"/>
-        <w:jc w:val="both"/>
-      </w:pPr>
-      <w:r>
-        <w:rPr>
-          <w:b w:val="false"/>
-          <w:bCs w:val="false"/>
-          <w:i w:val="false"/>
-          <w:iCs w:val="false"/>
-        </w:rPr>
-        <w:t xml:space="preserve">ChargingIDS (Krum, cosine-similarity, CUSUM, gradient-explosion detection) protects FL convergence against Byzantine/poisoning clients — a client-side integrity concern (Scenario 2 in our threat model, §4). We state explicitly, having found and corrected our own earlier conflation of this point during development: no IDS mechanism provides any privacy guarantee against the honest-but-curious server this paper's MIA results are about. Integrity and privacy are two orthogonal domains in this architecture; ChargingIDS is never cited here as an MIA defense, active or passive.</w:t>
+        <w:t xml:space="preserve">3.3 ByzantineDetector: a formally separate integrity domain</w:t>
+      </w:r>
+    </w:p>
+    <w:p>
+      <w:pPr>
+        <w:spacing w:after="160"/>
+        <w:jc w:val="both"/>
+      </w:pPr>
+      <w:r>
+        <w:rPr>
+          <w:b w:val="false"/>
+          <w:bCs w:val="false"/>
+          <w:i w:val="false"/>
+          <w:iCs w:val="false"/>
+        </w:rPr>
+        <w:t xml:space="preserve">ByzantineDetector (Krum, cosine-similarity, CUSUM, gradient-explosion detection) protects FL convergence against Byzantine/poisoning clients — a client-side integrity concern (Scenario 2 in our threat model, §4). We state explicitly, having found and corrected our own earlier conflation of this point during development: no IDS mechanism provides any privacy guarantee against the honest-but-curious server this paper's MIA results are about. Integrity and privacy are two orthogonal domains in this architecture; ByzantineDetector is never cited here as an MIA defense, active or passive.</w:t>
       </w:r>
     </w:p>
     <w:p>
@@ -522,7 +522,7 @@
           <w:i w:val="false"/>
           <w:iCs w:val="false"/>
         </w:rPr>
-        <w:t xml:space="preserve">We discuss, without evaluating, two open questions: a bespoke attack tailored to this exact autoencoder/FedProx/ACN-Data setup (S5a, not literature-standard Yeom/Shadow/LiRA), and evasion of the Privacy Auditor's own scoring (S5b). We explicitly reject a candidate resolution we considered and rejected during development — that ChargingIDS's stability controls would catch an adaptive privacy attacker — because Scenario 1 defines clients as honest by construction: any attacker that deviates from protocol to evade the Auditor is, by definition, Scenario 2, not a legitimate "active-but-still-Scenario-1" attacker. We state this as a formal dual-defense architecture with two orthogonal domains (Integrity via ChargingIDS, Scenario 2; Privacy via the Auditor + DP, Scenario 1) rather than claim either component covers both.</w:t>
+        <w:t xml:space="preserve">We discuss, without evaluating, two open questions: a bespoke attack tailored to this exact autoencoder/FedProx/ACN-Data setup (S5a, not literature-standard Yeom/Shadow/LiRA), and evasion of the Privacy Auditor's own scoring (S5b). We explicitly reject a candidate resolution we considered and rejected during development — that ByzantineDetector's stability controls would catch an adaptive privacy attacker — because Scenario 1 defines clients as honest by construction: any attacker that deviates from protocol to evade the Auditor is, by definition, Scenario 2, not a legitimate "active-but-still-Scenario-1" attacker. We state this as a formal dual-defense architecture with two orthogonal domains (Integrity via ByzantineDetector, Scenario 2; Privacy via the Auditor + DP, Scenario 1) rather than claim either component covers both.</w:t>
       </w:r>
     </w:p>
     <w:p>
@@ -1171,7 +1171,7 @@
           <w:i w:val="false"/>
           <w:iCs w:val="false"/>
         </w:rPr>
-        <w:t xml:space="preserve">The full 5-seed × 8-configuration campaign completed on 2026-08-30 (seeds 42, 123, 456, 789, 1234; ~101 hours wall-clock, sequential execution). Table 2 reports, for each configuration, the mean composed LiRA AUC-ROC across 5 independent seeds, its 95% bootstrap confidence interval (10,000 resamples), and a two-sided significance test against the chance level (AUC = 0.5).</w:t>
+        <w:t xml:space="preserve">The full 5-seed × 10-configuration campaign completed on 2026-09-08 (seeds 42, 123, 456, 789, 1234; ~108 hours / 6,485 minutes wall-clock, sequential execution). Table 2 reports, for each configuration, the mean composed LiRA AUC-ROC across 5 independent seeds, its 95% bootstrap confidence interval (10,000 resamples), and a two-sided significance test against the chance level (AUC = 0.5).</w:t>
       </w:r>
     </w:p>
     <w:tbl>
@@ -1249,7 +1249,7 @@
                 <w:sz w:val="18"/>
                 <w:szCs w:val="18"/>
               </w:rPr>
-              <w:t xml:space="preserve">p vs. AUC=0.5 (sign test)</w:t>
+              <w:t xml:space="preserve">p vs. AUC=0.5 (Wilcoxon)</w:t>
             </w:r>
           </w:p>
         </w:tc>
@@ -1311,7 +1311,7 @@
                 <w:sz w:val="18"/>
                 <w:szCs w:val="18"/>
               </w:rPr>
-              <w:t xml:space="preserve">1.0000</w:t>
+              <w:t xml:space="preserve">0.6250</w:t>
             </w:r>
           </w:p>
         </w:tc>
@@ -1373,7 +1373,7 @@
                 <w:sz w:val="18"/>
                 <w:szCs w:val="18"/>
               </w:rPr>
-              <w:t xml:space="preserve">1.0000</w:t>
+              <w:t xml:space="preserve">0.8125</w:t>
             </w:r>
           </w:p>
         </w:tc>
@@ -1435,7 +1435,7 @@
                 <w:sz w:val="18"/>
                 <w:szCs w:val="18"/>
               </w:rPr>
-              <w:t xml:space="preserve">0.3750</w:t>
+              <w:t xml:space="preserve">0.3125</w:t>
             </w:r>
           </w:p>
         </w:tc>
@@ -1529,7 +1529,7 @@
                 <w:sz w:val="18"/>
                 <w:szCs w:val="18"/>
               </w:rPr>
-              <w:t xml:space="preserve">0.5004 (σ=0.0008)</w:t>
+              <w:t xml:space="preserve">0.5005 (σ=0.0012)</w:t>
             </w:r>
           </w:p>
         </w:tc>
@@ -1544,7 +1544,7 @@
                 <w:sz w:val="18"/>
                 <w:szCs w:val="18"/>
               </w:rPr>
-              <w:t xml:space="preserve">[0.4998, 0.5010]</w:t>
+              <w:t xml:space="preserve">[0.4996, 0.5014]</w:t>
             </w:r>
           </w:p>
         </w:tc>
@@ -1559,7 +1559,7 @@
                 <w:sz w:val="18"/>
                 <w:szCs w:val="18"/>
               </w:rPr>
-              <w:t xml:space="preserve">1.0000</w:t>
+              <w:t xml:space="preserve">0.3125</w:t>
             </w:r>
           </w:p>
         </w:tc>
@@ -1576,7 +1576,7 @@
                 <w:sz w:val="18"/>
                 <w:szCs w:val="18"/>
               </w:rPr>
-              <w:t xml:space="preserve">central, ε=0.1</w:t>
+              <w:t xml:space="preserve">central, ε=0.5</w:t>
             </w:r>
           </w:p>
         </w:tc>
@@ -1591,7 +1591,7 @@
                 <w:sz w:val="18"/>
                 <w:szCs w:val="18"/>
               </w:rPr>
-              <w:t xml:space="preserve">0.5005 (σ=0.0010)</w:t>
+              <w:t xml:space="preserve">0.4999 (σ=0.0009)</w:t>
             </w:r>
           </w:p>
         </w:tc>
@@ -1606,7 +1606,7 @@
                 <w:sz w:val="18"/>
                 <w:szCs w:val="18"/>
               </w:rPr>
-              <w:t xml:space="preserve">[0.4997, 0.5013]</w:t>
+              <w:t xml:space="preserve">[0.4992, 0.5006]</w:t>
             </w:r>
           </w:p>
         </w:tc>
@@ -1621,7 +1621,7 @@
                 <w:sz w:val="18"/>
                 <w:szCs w:val="18"/>
               </w:rPr>
-              <w:t xml:space="preserve">0.3750</w:t>
+              <w:t xml:space="preserve">0.8125</w:t>
             </w:r>
           </w:p>
         </w:tc>
@@ -1638,7 +1638,7 @@
                 <w:sz w:val="18"/>
                 <w:szCs w:val="18"/>
               </w:rPr>
-              <w:t xml:space="preserve">local, ε=1.0</w:t>
+              <w:t xml:space="preserve">central, ε=0.1</w:t>
             </w:r>
           </w:p>
         </w:tc>
@@ -1653,7 +1653,7 @@
                 <w:sz w:val="18"/>
                 <w:szCs w:val="18"/>
               </w:rPr>
-              <w:t xml:space="preserve">0.5000 (σ=0.0004)</w:t>
+              <w:t xml:space="preserve">0.5005 (σ=0.0009)</w:t>
             </w:r>
           </w:p>
         </w:tc>
@@ -1668,7 +1668,7 @@
                 <w:sz w:val="18"/>
                 <w:szCs w:val="18"/>
               </w:rPr>
-              <w:t xml:space="preserve">[0.4996, 0.5003]</w:t>
+              <w:t xml:space="preserve">[0.4998, 0.5013]</w:t>
             </w:r>
           </w:p>
         </w:tc>
@@ -1683,7 +1683,7 @@
                 <w:sz w:val="18"/>
                 <w:szCs w:val="18"/>
               </w:rPr>
-              <w:t xml:space="preserve">1.0000</w:t>
+              <w:t xml:space="preserve">0.4375</w:t>
             </w:r>
           </w:p>
         </w:tc>
@@ -1700,6 +1700,130 @@
                 <w:sz w:val="18"/>
                 <w:szCs w:val="18"/>
               </w:rPr>
+              <w:t xml:space="preserve">local, ε=1.0</w:t>
+            </w:r>
+          </w:p>
+        </w:tc>
+        <w:tc>
+          <w:tcPr>
+            <w:tcW w:type="dxa" w:w="1870"/>
+            <w:shd w:fill="F2F2F2" w:val="clear"/>
+          </w:tcPr>
+          <w:p>
+            <w:r>
+              <w:rPr>
+                <w:sz w:val="18"/>
+                <w:szCs w:val="18"/>
+              </w:rPr>
+              <w:t xml:space="preserve">0.5000 (σ=0.0004)</w:t>
+            </w:r>
+          </w:p>
+        </w:tc>
+        <w:tc>
+          <w:tcPr>
+            <w:tcW w:type="dxa" w:w="2340"/>
+            <w:shd w:fill="F2F2F2" w:val="clear"/>
+          </w:tcPr>
+          <w:p>
+            <w:r>
+              <w:rPr>
+                <w:sz w:val="18"/>
+                <w:szCs w:val="18"/>
+              </w:rPr>
+              <w:t xml:space="preserve">[0.4996, 0.5003]</w:t>
+            </w:r>
+          </w:p>
+        </w:tc>
+        <w:tc>
+          <w:tcPr>
+            <w:tcW w:type="dxa" w:w="2800"/>
+            <w:shd w:fill="F2F2F2" w:val="clear"/>
+          </w:tcPr>
+          <w:p>
+            <w:r>
+              <w:rPr>
+                <w:sz w:val="18"/>
+                <w:szCs w:val="18"/>
+              </w:rPr>
+              <w:t xml:space="preserve">0.8125</w:t>
+            </w:r>
+          </w:p>
+        </w:tc>
+      </w:tr>
+      <w:tr>
+        <w:tc>
+          <w:tcPr>
+            <w:tcW w:type="dxa" w:w="2340"/>
+            <w:shd w:fill="F2F2F2" w:val="clear"/>
+          </w:tcPr>
+          <w:p>
+            <w:r>
+              <w:rPr>
+                <w:sz w:val="18"/>
+                <w:szCs w:val="18"/>
+              </w:rPr>
+              <w:t xml:space="preserve">local, ε=0.5</w:t>
+            </w:r>
+          </w:p>
+        </w:tc>
+        <w:tc>
+          <w:tcPr>
+            <w:tcW w:type="dxa" w:w="1870"/>
+            <w:shd w:fill="F2F2F2" w:val="clear"/>
+          </w:tcPr>
+          <w:p>
+            <w:r>
+              <w:rPr>
+                <w:sz w:val="18"/>
+                <w:szCs w:val="18"/>
+              </w:rPr>
+              <w:t xml:space="preserve">0.4995 (σ=0.0010)</w:t>
+            </w:r>
+          </w:p>
+        </w:tc>
+        <w:tc>
+          <w:tcPr>
+            <w:tcW w:type="dxa" w:w="2340"/>
+            <w:shd w:fill="F2F2F2" w:val="clear"/>
+          </w:tcPr>
+          <w:p>
+            <w:r>
+              <w:rPr>
+                <w:sz w:val="18"/>
+                <w:szCs w:val="18"/>
+              </w:rPr>
+              <w:t xml:space="preserve">[0.4987, 0.5002]</w:t>
+            </w:r>
+          </w:p>
+        </w:tc>
+        <w:tc>
+          <w:tcPr>
+            <w:tcW w:type="dxa" w:w="2800"/>
+            <w:shd w:fill="F2F2F2" w:val="clear"/>
+          </w:tcPr>
+          <w:p>
+            <w:r>
+              <w:rPr>
+                <w:sz w:val="18"/>
+                <w:szCs w:val="18"/>
+              </w:rPr>
+              <w:t xml:space="preserve">0.3125</w:t>
+            </w:r>
+          </w:p>
+        </w:tc>
+      </w:tr>
+      <w:tr>
+        <w:tc>
+          <w:tcPr>
+            <w:tcW w:type="dxa" w:w="2340"/>
+            <w:shd w:fill="F2F2F2" w:val="clear"/>
+          </w:tcPr>
+          <w:p>
+            <w:r>
+              <w:rPr>
+                <w:sz w:val="18"/>
+                <w:szCs w:val="18"/>
+              </w:rPr>
               <w:t xml:space="preserve">local, ε=0.1</w:t>
             </w:r>
           </w:p>
@@ -1768,7 +1892,7 @@
           <w:i w:val="false"/>
           <w:iCs w:val="false"/>
         </w:rPr>
-        <w:t xml:space="preserve">Every one of the 8 configurations' 95% bootstrap CI contains 0.5, and no mean deviates from 0.5 by more than 0.0005 in absolute terms — an order of magnitude tighter than the 0.60 positive-control threshold used in the sanity check (§6). This holds uniformly across DP placement (dp-fedavg / central / local) and privacy budget (ε ∈ {0.1, 0.5, 1.0}, plus no DP at all), directly answering this paper's central question: no, applying differential privacy to the FL communication channel does not need to "work" to prevent LiRA-detectable membership leakage in this architecture — no detectable leakage was present even without any DP applied.</w:t>
+        <w:t xml:space="preserve">Every one of the 10 configurations' 95% bootstrap CI contains 0.5, and no mean deviates from 0.5 by more than 0.0005 in absolute terms — an order of magnitude tighter than the 0.60 positive-control threshold used in the sanity check (§6). This holds uniformly across DP placement (dp-fedavg / central / local) and privacy budget (ε ∈ {0.1, 0.5, 1.0}, plus no DP at all), directly answering this paper's central question: no, applying differential privacy to the FL communication channel does not need to "work" to prevent LiRA-detectable membership leakage in this architecture — no detectable leakage was present even without any DP applied.</w:t>
       </w:r>
     </w:p>
     <w:p>
@@ -1782,7 +1906,7 @@
           <w:iCs/>
           <w:color w:val="8B0000"/>
         </w:rPr>
-        <w:t xml:space="preserve">NOTA (aggiornata 2026-09-04): la tabella sopra usava p-value da sign test (scipy assente nel sandbox che ha generato questa bozza). AGGIORNAMENTO 2026-09-03: un vero test di Wilcoxon e' stato eseguito sulla macchina reale dell'utente (scipy disponibile) — nessuno degli 8 gruppi risulta significativo (p&gt;0.05), dettaglio in docs/MetricsReference_DSN2027.md §8. AGGIORNAMENTO 2026-09-04: trovato e corretto un bug di conflazione dati che gonfiava il gruppo “no-DP baseline” a n=10 invece di n=5 (entity-split-sweep1, un esperimento di robustezza, veniva raggruppato per errore con nodp-sweep1) — anche il Wilcoxon del 2026-09-03 usava quindi l'n sbagliato per quel gruppo. Il bootstrap CI ricalcolato con l'n corretto ([0.4997, 0.5009]) ora CONTIENE 0.5, risolvendo il disaccordo bootstrap-vs-Wilcoxon precedentemente notato per quel gruppo — ma serve un ultimo rilancio (python3 scripts/check_significance.py su una macchina con scipy) per un p-value Wilcoxon aggiornato prima di citare numeri esatti nella submission finale. La lettura qualitativa (nessuna configurazione mostra AUC significativamente sopra 0.5) resta confermata. TPR@low-FPR (0.1%/1%/5%) NON disponibile per questa campagna: il campo e' stato aggiunto al codice (Sprint 10pp, 2026-08-28) DOPO che la campagna era gia' in esecuzione sulla macchina dell'utente — nessuno dei 40 file JSON di questo run lo contiene (verificato). Da includere nella prossima campagna (task #52, in corso dal 2026-09-04).</w:t>
+        <w:t xml:space="preserve">NOTA (aggiornata 2026-09-08): la tabella sopra riporta ora i numeri DEFINITIVI. La campagna task #52 (5 seed × 10 configurazioni, comprese le 2 configurazioni central/local ε=0.5 assenti dalla campagna precedente) si e' conclusa il 2026-09-08 (∼108 ore / 6.485 minuti wall-clock). Al completamento e' stato trovato e corretto un secondo bug reale di conflazione dati (task #73, oltre a quello entity-split gia' corretto il 2026-09-04): i rilanci della campagna riusavano gli stessi 5 seed (42/123/456/789/1234) gia' presenti nei run precedenti (per aggiungere metriche mancanti), ma venivano contati come osservazioni indipendenti aggiuntive invece che come sostituzioni — n gonfiato a 10 o 15 a seconda della configurazione; per “central” in particolare, mescolava anche dati pre-fix (prima della correzione di sensibilità DP pesata, task #26) con dati post-fix corretti. Fix: deduplicazione per (configurazione, seed), tenendo solo il file più recente per ogni seed. Con l'n=5 corretto per tutti e 10 i gruppi, il test di Wilcoxon REALE (scipy disponibile sulla macchina dell'utente, non il sign-test fallback) da' i p-value riportati in tabella — tutti ben sopra α=0.05 (range 0.3125–1.0000), nessun gruppo vicino alla significatività. TPR@low-FPR (0.1%/1%/5%, Sprint 10pp) è ora presente in tutti i file JSON di questa campagna (verificato), a differenza della campagna precedente dove il campo era stato aggiunto al codice dopo che il run era già partito. Nessun ulteriore rilancio necessario prima della submission per questi numeri.</w:t>
       </w:r>
     </w:p>
     <w:p>
@@ -1964,7 +2088,7 @@
         <w:spacing w:after="90"/>
       </w:pPr>
       <w:r>
-        <w:t xml:space="preserve">Results are validated on real ACN-Data in both simulation and a real deployment; the full 5-seed × 8-configuration bootstrap campaign (§7) is complete. A true Wilcoxon signed-rank test was subsequently run on a machine with scipy (2026-09-03): none of the 8 configuration groups shows AUC significantly different from 0.5 (p&gt;0.05 throughout). A data-conflation bug was then found and fixed (2026-09-04): the "no-DP baseline" group had silently included 5 files from an unrelated robustness experiment (entity-aware train/holdout split) alongside its own 5 real seeds, inflating n from 5 to 10; the corrected bootstrap CI for that group now contains 0.5 (it previously did not), resolving an earlier bootstrap-vs-Wilcoxon disagreement. The campaign should be re-analyzed once more with the fix applied (scripts/check_significance.py) to obtain final, citable p-values before submission — the qualitative conclusion (no configuration shows significant leakage) is unaffected. TPR@low-FPR was implemented in the codebase after this campaign had already started running and is not present in any of its 40 result files; the in-progress relaunch (task #52) will include it.</w:t>
+        <w:t xml:space="preserve">Results are validated on real ACN-Data in both simulation and a real deployment; the full 5-seed × 10-configuration bootstrap campaign (§7) is complete, including the two configurations (central/local, ε=0.5) missing from the earlier 8-configuration run. A true Wilcoxon signed-rank test was run on a machine with scipy: none of the 10 configuration groups shows AUC significantly different from 0.5 (p ranging 0.3125–1.0000, all far above 0.05). Two real data-conflation bugs were found and fixed during this process: first (2026-09-04), the "no-DP baseline" group had silently included files from an unrelated robustness experiment (entity-aware train/holdout split) alongside its own real seeds, inflating n from 5 to 10; second (2026-09-08), the campaign’s own reruns — which reused the same 5 seeds to add previously-missing metrics rather than to add statistical power — were counted as additional independent observations instead of replacements, inflating n to 10 or 15 depending on configuration, and for “central” specifically mixing pre-fix data (before a DP-sensitivity correction, see §3.4) with corrected post-fix data. Both are fixed via deduplication by (configuration, seed), keeping only the most recent file per seed; all 10 groups now correctly show n=5. TPR@low-FPR is present in every result file of this final campaign (the field was implemented after the earlier, superseded 8-configuration run had already started, which is why that run lacked it).</w:t>
       </w:r>
     </w:p>
     <w:p>
@@ -2041,7 +2165,7 @@
           <w:i w:val="false"/>
           <w:iCs w:val="false"/>
         </w:rPr>
-        <w:t xml:space="preserve">[DRAFT — review and finalize with all authors before submission.] We used Claude (Anthropic) throughout the implementation of the ChargeShield-FL codebase (ML Plane, Privacy Auditor, ChargingIDS, the Yeom/Shadow/LiRA attack implementations, the experiment runner, and the statistical analysis scripts referenced in this paper), under continuous human direction, review, and empirical verification at every step. All reported experimental results were produced by executing the resulting code and analyzing its real output; no numeric result in this paper is AI-generated or simulated. This draft of the paper text itself was assembled by Claude from the authors' own design documents and decisions, and requires full human review, verification, and revision before submission.</w:t>
+        <w:t xml:space="preserve">[DRAFT — review and finalize with all authors before submission.] We used Claude (Anthropic) throughout the implementation of the ChargeShield-FL codebase (ML Plane, Privacy Auditor, ByzantineDetector, the Yeom/Shadow/LiRA attack implementations, the experiment runner, and the statistical analysis scripts referenced in this paper), under continuous human direction, review, and empirical verification at every step. All reported experimental results were produced by executing the resulting code and analyzing its real output; no numeric result in this paper is AI-generated or simulated. This draft of the paper text itself was assembled by Claude from the authors' own design documents and decisions, and requires full human review, verification, and revision before submission.</w:t>
       </w:r>
     </w:p>
     <w:p>

</xml_diff>

<commit_message>
Fix bug UTC in ChargePlace Scotland adapter + riscrivi sezione canary del paper (§6.2/§9)
- src/adapters/chargeplace_scotland_adapter.py: start_time/end_time/
  done_charging_time erano ora locale Europe/London grezza invece di UTC
  (contratto violato rispetto ad acn_dataset.py), causando uno
  sfasamento di +1h in hour_of_day durante l'ora legale BST. Fix:
  localizza e converte a UTC via zoneinfo in _parse_record(). 30/30 test
  invariati. Nessun risultato pubblicato affetto (dataset mai usato in
  un esperimento reale).
- docs/paper/ChargeShield-FL_DSN2027_paper_skeleton.docx: §6.2/§9
  aggiornate con i numeri post-fix del canary positive control
  (0.6375/0.6625/0.5875, composto 0.6875) e la sfumatura completa
  (mancata replica caltech/jpl, mancata rilevazione anche a densita'
  equiparata). Validato + ispezionato visivamente.
- README.md: Sprint 10zz+66.
</commit_message>
<xml_diff>
--- a/docs/paper/ChargeShield-FL_DSN2027_paper_skeleton.docx
+++ b/docs/paper/ChargeShield-FL_DSN2027_paper_skeleton.docx
@@ -1148,7 +1148,7 @@
                 <w:sz w:val="18"/>
                 <w:szCs w:val="18"/>
               </w:rPr>
-              <w:t xml:space="preserve">0.4863 / 0.6265 / 0.4250</w:t>
+              <w:t xml:space="preserve">0.6375 / 0.6625 / 0.5875</w:t>
             </w:r>
           </w:p>
         </w:tc>
@@ -1163,7 +1163,7 @@
                 <w:sz w:val="18"/>
                 <w:szCs w:val="18"/>
               </w:rPr>
-              <w:t xml:space="preserve">Unstable, near chance</w:t>
+              <w:t xml:space="preserve">Detects canary, composed 0.6875</w:t>
             </w:r>
           </w:p>
         </w:tc>
@@ -1186,7 +1186,7 @@
           <w:i w:val="false"/>
           <w:iCs w:val="false"/>
         </w:rPr>
-        <w:t xml:space="preserve">The target model's raw reconstruction loss cleanly and consistently distinguishes canary members from held-out canary non-members in every round (canary members reconstruct 4–7× more accurately) — an unambiguous positive control: the model and a loss-threshold detector both clearly pick up a deliberately engineered vulnerability. The calibrated LiRA score on the same canaries, by contrast, stays unstable and near chance. We attribute this to LiRA's shadow models being trained on the same shared population that now contains 150 duplicate canary copies, so their own random IN/OUT subsampling draws multiple near-identical copies regardless of which specific copy is nominally held out for a given shadow, diluting the differential signal LiRA's calibration relies on — a methodological artifact specific to literal near-duplicate records in a population shared between target and shadow training. Natural EV sessions in our dataset are never literal duplicates of one another, so this does not extend to, or undermine, the null result in §7.</w:t>
+        <w:t xml:space="preserve">The target model's raw reconstruction loss cleanly and consistently distinguishes canary members from held-out canary non-members in every round at every site tested (canary members reconstruct 4–7× more accurately at Office 1; qualitatively similar separation at Caltech and JPL) — an unambiguous positive control at the loss level. The calibrated LiRA score is more nuanced. After fixing a shadow-sampling contamination bug (duplicate canary copies could previously fragment across a single shadow's IN/OUT split, diluting the differential signal LiRA's calibration relies on), calibrated LiRA on the Office 1 canaries — the densest insertion, ≈11% of that client's training set — detects the canary consistently across all three rounds (0.6375 / 0.6625 / 0.5875, composed 0.6875), above our pre-declared 0.60 threshold. It remains systematically weaker than the raw-loss signal, which we attribute to a separate, still-open limitation: LiRA's Gaussian calibration operates at its per-shadow variance floor in 96–99% of cases in this run rather than on genuine per-shadow variance. Replicating the identical protocol at Caltech and JPL — where duplicate density is far lower (≈0.5% of local training data, since both clients have larger local datasets than Office 1) — does not reproduce the calibrated-LiRA signal (Caltech composed AUC 0.42–0.50; JPL composed AUC 0.5368), consistent with a density-dependent effect. To isolate density from site, we re-ran the canary insertion at Caltech with density matched to Office 1's (≈10% of local training data, n_templates=84): calibrated LiRA still failed to detect the canary (AUC 0.46–0.53, near or below chance), so duplicate density alone does not fully explain the Office 1/Caltech gap either — the site-dependence of calibrated LiRA's canary sensitivity is only partially understood and is reported here as an open methodological nuance, not a resolved one. In every case this is a property of LiRA's calibration under an artificial near-duplicate-record design; natural EV sessions in our dataset are never literal duplicates of one another, so none of this extends to, or undermines, the null result in §7.</w:t>
       </w:r>
     </w:p>
     <w:p>
@@ -2426,7 +2426,7 @@
         <w:spacing w:after="90"/>
       </w:pPr>
       <w:r>
-        <w:t xml:space="preserve">A positive control was obtained via canary insertion (§6.2), but only at the raw reconstruction-loss level (AUC 0.70–0.90, stable), not at the level of the calibrated LiRA score itself (AUC 0.43–0.63, unstable) — we attribute the gap to shadow-model contamination specific to literal near-duplicate records shared between target and shadow training populations, a methodological limitation of LiRA's calibration under canary-style auditing rather than evidence against the harness's underlying sensitivity or against the natural-data null result in §7.</w:t>
+        <w:t xml:space="preserve">A positive control was obtained via canary insertion (§6.2): the raw reconstruction loss detects it at every site tested (AUC 0.70–0.90 at Office 1); the calibrated LiRA score detects it reliably only at Office 1 (composed AUC 0.6875, after fixing a shadow-sampling contamination bug), and fails to reproduce the signal at Caltech/JPL even when duplicate density is matched to Office 1's (≈10%) — a site-dependence in LiRA's calibration under this artificial near-duplicate design that is only partially understood, not evidence against the harness's underlying sensitivity or against the natural-data null result in §7.</w:t>
       </w:r>
     </w:p>
     <w:p>

</xml_diff>

<commit_message>
Sprint 10zz+79: iperparametri training (§5) + metodologia seed esplicita (§7) nel paper, EN+IT
</commit_message>
<xml_diff>
--- a/docs/paper/ChargeShield-FL_DSN2027_paper_skeleton.docx
+++ b/docs/paper/ChargeShield-FL_DSN2027_paper_skeleton.docx
@@ -600,7 +600,7 @@
           <w:i w:val="false"/>
           <w:iCs w:val="false"/>
         </w:rPr>
-        <w:t xml:space="preserve">We use ACN-Data [10], the only publicly available real-world EV-charging session dataset at this scale, across its three real sites (Caltech, 54 EVSE; JPL, 50 EVSE; Office 1, 8 EVSE) — an Enterprise Cross-Silo FL setting [13], not a synthetically fragmented single dataset. Each client trains a small autoencoder (570 parameters: 6 → 16 → 8 → 4 → 8 → 16 → 6) over six continuous session features (energy delivered, average power, requested energy, declared availability window, connection hour, session duration) via FedAvg/FedProx.</w:t>
+        <w:t xml:space="preserve">We use ACN-Data [10], the only publicly available real-world EV-charging session dataset at this scale, across its three real sites (Caltech, 54 EVSE; JPL, 50 EVSE; Office 1, 8 EVSE) — an Enterprise Cross-Silo FL setting [13], not a synthetically fragmented single dataset. Each client trains a small autoencoder (570 parameters: 6 → 16 → 8 → 4 → 8 → 16 → 6) over six continuous session features (energy delivered, average power, requested energy, declared availability window, connection hour, session duration) via FedAvg/FedProx. Each client trains with Adam (learning rate 0.001, batch size 32) for 50 local epochs per FL round, over 10 rounds per experiment.</w:t>
       </w:r>
     </w:p>
     <w:p>
@@ -1225,7 +1225,7 @@
           <w:i w:val="false"/>
           <w:iCs w:val="false"/>
         </w:rPr>
-        <w:t xml:space="preserve">The full 5-seed × 10-configuration campaign completed on 2026-09-08 (seeds 42, 123, 456, 789, 1234; ~108 hours / 6,485 minutes wall-clock, sequential execution). Table 2 reports, for each configuration, the mean composed LiRA AUC-ROC across 5 independent seeds, its 95% bootstrap confidence interval (10,000 resamples), and a two-sided significance test against the chance level (AUC = 0.5).</w:t>
+        <w:t xml:space="preserve">The full 5-seed × 10-configuration campaign completed on 2026-09-08 (seeds 42, 123, 456, 789, 1234; ~108 hours / 6,485 minutes wall-clock, sequential execution). Each seed re-seeds model weight initialization, the client train/holdout split and shuffling order, and every subsequent stochastic draw (DP noise, shadow-model sampling) via random.seed/numpy.random.seed/torch.manual_seed, so the 5 runs per configuration are genuinely independent repetitions of the same experiment — not 5 readings of a single run — the precondition for the bootstrap/Wilcoxon analysis below. Table 2 reports, for each configuration, the mean composed LiRA AUC-ROC across 5 independent seeds, its 95% bootstrap confidence interval (10,000 resamples), and a two-sided significance test against the chance level (AUC = 0.5).</w:t>
       </w:r>
     </w:p>
     <w:tbl>

</xml_diff>

<commit_message>
Sprint 10zz+80: esplicitata granularità client-level del clipping DP (§3.4, §9), EN+IT
</commit_message>
<xml_diff>
--- a/docs/paper/ChargeShield-FL_DSN2027_paper_skeleton.docx
+++ b/docs/paper/ChargeShield-FL_DSN2027_paper_skeleton.docx
@@ -441,7 +441,7 @@
           <w:i w:val="false"/>
           <w:iCs w:val="false"/>
         </w:rPr>
-        <w:t xml:space="preserve">We evaluate three placements of client-update clipping and Gaussian noising relative to FedAvg aggregation: dp-fedavg (per-client clip + noise before aggregation — the server transiently observes the raw update, which is exactly what LiRA is built to attack); central (client-side clip only, a single aggregate-level noise draw post-FedAvg — matches McMahan et al.'s [3] Algorithm 1 literally; individual client contributions are never noised); and local (per-client clip + noise, with the raw update never transmitted to or observed by the server, not even transiently).</w:t>
+        <w:t xml:space="preserve">We evaluate three placements of client-update clipping and Gaussian noising relative to FedAvg aggregation: dp-fedavg (per-client clip + noise before aggregation — the server transiently observes the raw update, which is exactly what LiRA is built to attack); central (client-side clip only, a single aggregate-level noise draw post-FedAvg — matches McMahan et al.'s [3] Algorithm 1 literally; individual client contributions are never noised); and local (per-client clip + noise, with the raw update never transmitted to or observed by the server, not even transiently). All three placements clip and noise at client granularity: the unit of protection is a client's per-round contribution as a whole — the notion McMahan et al. [3] formalize as client-level DP — not per-example DP-SGD (Abadi et al. [7]), which instead bounds the influence of a single training record. LiRA targets exactly that finer granularity: it asks whether one specific charging session, inside one client's local training set, can be detected as a member. None of our three placements is calibrated to bound a single record's contribution to its client's local training, so client-level clipping provides no formal guarantee at the granularity LiRA actually attacks. Our result is therefore an empirical measurement of whether a record-level attacker finds detectable leakage under a client-level DP configuration, not a claim that client-level DP formally protects individual sessions — the same gap between theoretical guarantee and empirical attack surface that motivates this paper's central question (§1).</w:t>
       </w:r>
     </w:p>
     <w:p>
@@ -2415,7 +2415,7 @@
         <w:spacing w:after="90"/>
       </w:pPr>
       <w:r>
-        <w:t xml:space="preserve">Fixed-threshold gradient clipping only; the DP comparison is across placement (dp-fedavg/central/local), not across clipping strategy — adaptive/percentile-based clipping is future work.</w:t>
+        <w:t xml:space="preserve">Fixed-threshold gradient clipping only; the DP comparison is across placement (dp-fedavg/central/local), not across clipping strategy — adaptive/percentile-based clipping is future work. Client-level clipping only (§3.4): none of the three placements bounds a single record's contribution the way per-example DP-SGD does; implementing and evaluating true per-example DP-SGD as a fourth placement is future work.</w:t>
       </w:r>
     </w:p>
     <w:p>

</xml_diff>

<commit_message>
Sprint 10zz+81: gap naive-composition verificato (50x NC/RDP, 0.399@eps=1000) in §2/§3.4/§9, EN+IT
</commit_message>
<xml_diff>
--- a/docs/paper/ChargeShield-FL_DSN2027_paper_skeleton.docx
+++ b/docs/paper/ChargeShield-FL_DSN2027_paper_skeleton.docx
@@ -291,7 +291,7 @@
           <w:i w:val="false"/>
           <w:iCs w:val="false"/>
         </w:rPr>
-        <w:t xml:space="preserve">Differential privacy is defined to hide whether any single record participated in training, while membership inference attacks are defined to detect exactly that presence or absence — a direct conceptual opposition that Jayaraman and Evans [14] invoke to motivate empirical MIA auditing as the natural test of whether a DP guarantee holds in practice, rather than trusting the theoretical bound alone. They also provide the closest prior empirical measurement of the gap between differential privacy's theoretical guarantee (ε) and the leakage an actual attack extracts, finding that several relaxed DP notions reduce the noise needed for acceptable utility at a measurable cost in increased membership-inference leakage — but only for centralized DP-SGD training on standard benchmarks. We perform the same class of measurement in a federated, cross-silo setting: three concrete DP placements ("dp-fedavg", "central", "local") evaluated against a Yeom/Shadow/LiRA attack hierarchy on real, organizationally-distinct EV-charging clients (ACN-Data), rather than a single centralized model on standard benchmark data. Where their measurements do find leakage in the configurations they test, ours instead returns a null result — no LiRA-detectable leakage at any placement or ε tested, including no DP — a harder finding to report responsibly, since an absent signal is also consistent with an insensitive measurement tool, not only with an absent privacy risk. We address this directly with the five-axis sanity check and canary-insertion positive control of §6, which rule out an insensitive attack harness as the explanation for the null result. Finally, our ML Plane and Privacy Auditor (§3) turn Jayaraman and Evans's central empirical question — does the theoretical guarantee actually hold in practice? — into a standing, reusable observability layer decoupled from the training loop, rather than a one-off measurement script: the same architecture that produced this paper's result can, without modification, be pointed at a different attack, dataset, or DP configuration to ask the same question again.</w:t>
+        <w:t xml:space="preserve">Differential privacy is defined to hide whether any single record participated in training, while membership inference attacks are defined to detect exactly that presence or absence — a direct conceptual opposition that Jayaraman and Evans [14] invoke to motivate empirical MIA auditing as the natural test of whether a DP guarantee holds in practice, rather than trusting the theoretical bound alone. They also provide the closest prior empirical measurement of the gap between differential privacy's theoretical guarantee (ε) and the leakage an actual attack extracts, finding that several relaxed DP notions reduce the noise needed for acceptable utility at a measurable cost in increased membership-inference leakage — concretely, Rényi DP (RDP) matches naive composition's utility at a 50× tighter budget (53% accuracy loss at ε=10 versus ε=500 for the same loss under naive composition) on a neural-network classification benchmark, yet a white-box membership-inference attacker still achieves 0.399 advantage against the RDP-trained model at ε=1000 — but only for centralized DP-SGD training on standard benchmarks. We perform the same class of measurement in a federated, cross-silo setting: three concrete DP placements ("dp-fedavg", "central", "local") evaluated against a Yeom/Shadow/LiRA attack hierarchy on real, organizationally-distinct EV-charging clients (ACN-Data), rather than a single centralized model on standard benchmark data. Where their measurements do find leakage in the configurations they test, ours instead returns a null result — no LiRA-detectable leakage at any placement or ε tested, including no DP — a harder finding to report responsibly, since an absent signal is also consistent with an insensitive measurement tool, not only with an absent privacy risk. We address this directly with the five-axis sanity check and canary-insertion positive control of §6, which rule out an insensitive attack harness as the explanation for the null result. Finally, our ML Plane and Privacy Auditor (§3) turn Jayaraman and Evans's central empirical question — does the theoretical guarantee actually hold in practice? — into a standing, reusable observability layer decoupled from the training loop, rather than a one-off measurement script: the same architecture that produced this paper's result can, without modification, be pointed at a different attack, dataset, or DP configuration to ask the same question again.</w:t>
       </w:r>
     </w:p>
     <w:p>
@@ -441,7 +441,7 @@
           <w:i w:val="false"/>
           <w:iCs w:val="false"/>
         </w:rPr>
-        <w:t xml:space="preserve">We evaluate three placements of client-update clipping and Gaussian noising relative to FedAvg aggregation: dp-fedavg (per-client clip + noise before aggregation — the server transiently observes the raw update, which is exactly what LiRA is built to attack); central (client-side clip only, a single aggregate-level noise draw post-FedAvg — matches McMahan et al.'s [3] Algorithm 1 literally; individual client contributions are never noised); and local (per-client clip + noise, with the raw update never transmitted to or observed by the server, not even transiently). All three placements clip and noise at client granularity: the unit of protection is a client's per-round contribution as a whole — the notion McMahan et al. [3] formalize as client-level DP — not per-example DP-SGD (Abadi et al. [7]), which instead bounds the influence of a single training record. LiRA targets exactly that finer granularity: it asks whether one specific charging session, inside one client's local training set, can be detected as a member. None of our three placements is calibrated to bound a single record's contribution to its client's local training, so client-level clipping provides no formal guarantee at the granularity LiRA actually attacks. Our result is therefore an empirical measurement of whether a record-level attacker finds detectable leakage under a client-level DP configuration, not a claim that client-level DP formally protects individual sessions — the same gap between theoretical guarantee and empirical attack surface that motivates this paper's central question (§1).</w:t>
+        <w:t xml:space="preserve">We evaluate three placements of client-update clipping and Gaussian noising relative to FedAvg aggregation: dp-fedavg (per-client clip + noise before aggregation — the server transiently observes the raw update, which is exactly what LiRA is built to attack); central (client-side clip only, a single aggregate-level noise draw post-FedAvg — matches McMahan et al.'s [3] Algorithm 1 literally; individual client contributions are never noised); and local (per-client clip + noise, with the raw update never transmitted to or observed by the server, not even transiently). Our own composition accounting across FL rounds is naive, not RDP-based (§9); the gap Jayaraman and Evans document between naive and tighter composition is exactly why our reported multi-round privacy budget should be read as a conservative upper bound, not a tight guarantee. All three placements clip and noise at client granularity: the unit of protection is a client's per-round contribution as a whole — the notion McMahan et al. [3] formalize as client-level DP — not per-example DP-SGD (Abadi et al. [7]), which instead bounds the influence of a single training record. LiRA targets exactly that finer granularity: it asks whether one specific charging session, inside one client's local training set, can be detected as a member. None of our three placements is calibrated to bound a single record's contribution to its client's local training, so client-level clipping provides no formal guarantee at the granularity LiRA actually attacks. Our result is therefore an empirical measurement of whether a record-level attacker finds detectable leakage under a client-level DP configuration, not a claim that client-level DP formally protects individual sessions — the same gap between theoretical guarantee and empirical attack surface that motivates this paper's central question (§1).</w:t>
       </w:r>
     </w:p>
     <w:p>
@@ -2350,7 +2350,7 @@
           <w:i w:val="false"/>
           <w:iCs w:val="false"/>
         </w:rPr>
-        <w:t xml:space="preserve">We state eight limitations explicitly rather than let a reviewer discover them:</w:t>
+        <w:t xml:space="preserve">We state nine limitations explicitly rather than let a reviewer discover them:</w:t>
       </w:r>
     </w:p>
     <w:p>
@@ -2454,7 +2454,7 @@
         <w:spacing w:after="90"/>
       </w:pPr>
       <w:r>
-        <w:t xml:space="preserve">Results are validated on real ACN-Data in both simulation and a real deployment; the full 5-seed × 10-configuration bootstrap campaign (§7) is complete, including the two configurations (central/local, ε=0.5) missing from the earlier 8-configuration run. A true Wilcoxon signed-rank test was run on a machine with scipy: none of the 10 configuration groups shows AUC significantly different from 0.5 (p ranging 0.3125–1.0000, all far above 0.05). Two real data-conflation bugs were found and fixed during this process: first (2026-09-04), the "no-DP baseline" group had silently included files from an unrelated robustness experiment (entity-aware train/holdout split) alongside its own real seeds, inflating n from 5 to 10; second (2026-09-08), the campaign’s own reruns — which reused the same 5 seeds to add previously-missing metrics rather than to add statistical power — were counted as additional independent observations instead of replacements, inflating n to 10 or 15 depending on configuration, and for “central” specifically mixing pre-fix data (before a DP-sensitivity correction, see §3.4) with corrected post-fix data. Both are fixed via deduplication by (configuration, seed), keeping only the most recent file per seed; all 10 groups now correctly show n=5. TPR@low-FPR is present in every result file of this final campaign (the field was implemented after the earlier, superseded 8-configuration run had already started, which is why that run lacked it), and — per Carlini et al.'s [2] own argument that AUC-ROC can hide a low-FPR signal — has now been bootstrap/Wilcoxon-tested at FPR ∈ {0.1%, 1%, 5%} (§7), with the same null result as the AUC-ROC analysis.</w:t>
+        <w:t xml:space="preserve">Composition across FL rounds is naive (ε_total = ε_per_round × rounds), not Rényi DP (RDP) or zCDP — a real gap: Jayaraman and Evans [14] show naive composition needs 50× the budget RDP needs for matched utility on a comparable task (§2), so our reported multi-round ε is a conservative (loose) upper bound, not a tight guarantee. This does not affect the MIA measurements themselves, which are empirical and independent of the composition bound used to state the theoretical budget. A closed-form advanced-composition bound (Dwork and Roth [6]), or an RDP accountant for the Gaussian mechanism specifically, would tighten this number without requiring a full external DP-accounting library; neither is implemented here — future work. Results are validated on real ACN-Data in both simulation and a real deployment; the full 5-seed × 10-configuration bootstrap campaign (§7) is complete, including the two configurations (central/local, ε=0.5) missing from the earlier 8-configuration run. A true Wilcoxon signed-rank test was run on a machine with scipy: none of the 10 configuration groups shows AUC significantly different from 0.5 (p ranging 0.3125–1.0000, all far above 0.05). Two real data-conflation bugs were found and fixed during this process: first (2026-09-04), the "no-DP baseline" group had silently included files from an unrelated robustness experiment (entity-aware train/holdout split) alongside its own real seeds, inflating n from 5 to 10; second (2026-09-08), the campaign’s own reruns — which reused the same 5 seeds to add previously-missing metrics rather than to add statistical power — were counted as additional independent observations instead of replacements, inflating n to 10 or 15 depending on configuration, and for “central” specifically mixing pre-fix data (before a DP-sensitivity correction, see §3.4) with corrected post-fix data. Both are fixed via deduplication by (configuration, seed), keeping only the most recent file per seed; all 10 groups now correctly show n=5. TPR@low-FPR is present in every result file of this final campaign (the field was implemented after the earlier, superseded 8-configuration run had already started, which is why that run lacked it), and — per Carlini et al.'s [2] own argument that AUC-ROC can hide a low-FPR signal — has now been bootstrap/Wilcoxon-tested at FPR ∈ {0.1%, 1%, 5%} (§7), with the same null result as the AUC-ROC analysis.</w:t>
       </w:r>
     </w:p>
     <w:p>

</xml_diff>

<commit_message>
Sprint 10zz+84: citazione di rinforzo Rahman et al. 2018 (DSSGD eps>600000) in §2, EN+IT
</commit_message>
<xml_diff>
--- a/docs/paper/ChargeShield-FL_DSN2027_paper_skeleton.docx
+++ b/docs/paper/ChargeShield-FL_DSN2027_paper_skeleton.docx
@@ -291,7 +291,7 @@
           <w:i w:val="false"/>
           <w:iCs w:val="false"/>
         </w:rPr>
-        <w:t xml:space="preserve">Differential privacy is defined to hide whether any single record participated in training, while membership inference attacks are defined to detect exactly that presence or absence — a direct conceptual opposition that Jayaraman and Evans [14] invoke to motivate empirical MIA auditing as the natural test of whether a DP guarantee holds in practice, rather than trusting the theoretical bound alone. They also provide the closest prior empirical measurement of the gap between differential privacy's theoretical guarantee (ε) and the leakage an actual attack extracts, finding that several relaxed DP notions reduce the noise needed for acceptable utility at a measurable cost in increased membership-inference leakage — concretely, Rényi DP (RDP) matches naive composition's utility at a 50× tighter budget (53% accuracy loss at ε=10 versus ε=500 for the same loss under naive composition) on a neural-network classification benchmark, yet a white-box membership-inference attacker still achieves 0.399 advantage against the RDP-trained model at ε=1000 — but only for centralized DP-SGD training on standard benchmarks. We perform the same class of measurement in a federated, cross-silo setting: three concrete DP placements ("dp-fedavg", "central", "local") evaluated against a Yeom/Shadow/LiRA attack hierarchy on real, organizationally-distinct EV-charging clients (ACN-Data), rather than a single centralized model on standard benchmark data. Where their measurements do find leakage in the configurations they test, ours instead returns a null result — no LiRA-detectable leakage at any placement or ε tested, including no DP — a harder finding to report responsibly, since an absent signal is also consistent with an insensitive measurement tool, not only with an absent privacy risk. We address this directly with the five-axis sanity check and canary-insertion positive control of §6, which rule out an insensitive attack harness as the explanation for the null result. Finally, our ML Plane and Privacy Auditor (§3) turn Jayaraman and Evans's central empirical question — does the theoretical guarantee actually hold in practice? — into a standing, reusable observability layer decoupled from the training loop, rather than a one-off measurement script: the same architecture that produced this paper's result can, without modification, be pointed at a different attack, dataset, or DP configuration to ask the same question again.</w:t>
+        <w:t xml:space="preserve">Differential privacy is defined to hide whether any single record participated in training, while membership inference attacks are defined to detect exactly that presence or absence — a direct conceptual opposition that Jayaraman and Evans [14] invoke to motivate empirical MIA auditing as the natural test of whether a DP guarantee holds in practice, rather than trusting the theoretical bound alone. They also provide the closest prior empirical measurement of the gap between differential privacy's theoretical guarantee (ε) and the leakage an actual attack extracts, finding that several relaxed DP notions reduce the noise needed for acceptable utility at a measurable cost in increased membership-inference leakage — concretely, Rényi DP (RDP) matches naive composition's utility at a 50× tighter budget (53% accuracy loss at ε=10 versus ε=500 for the same loss under naive composition) on a neural-network classification benchmark, yet a white-box membership-inference attacker still achieves 0.399 advantage against the RDP-trained model at ε=1000 — but only for centralized DP-SGD training on standard benchmarks. The naive-composition cost this gap describes can be extreme in practice: Rahman et al. [15] note that Shokri and Shmatikov’s distributed SGD mechanism, which perturbs gradients per-parameter, delivers only ε&gt;2 per parameter and — composed naively over roughly 300,000 parameters — a total ε exceeding 600,000, which they judge to provide no meaningful privacy guarantee at all. We perform the same class of measurement in a federated, cross-silo setting: three concrete DP placements ("dp-fedavg", "central", "local") evaluated against a Yeom/Shadow/LiRA attack hierarchy on real, organizationally-distinct EV-charging clients (ACN-Data), rather than a single centralized model on standard benchmark data. Where their measurements do find leakage in the configurations they test, ours instead returns a null result — no LiRA-detectable leakage at any placement or ε tested, including no DP — a harder finding to report responsibly, since an absent signal is also consistent with an insensitive measurement tool, not only with an absent privacy risk. We address this directly with the five-axis sanity check and canary-insertion positive control of §6, which rule out an insensitive attack harness as the explanation for the null result. Finally, our ML Plane and Privacy Auditor (§3) turn Jayaraman and Evans's central empirical question — does the theoretical guarantee actually hold in practice? — into a standing, reusable observability layer decoupled from the training loop, rather than a one-off measurement script: the same architecture that produced this paper's result can, without modification, be pointed at a different attack, dataset, or DP configuration to ask the same question again.</w:t>
       </w:r>
     </w:p>
     <w:p>
@@ -2796,6 +2796,21 @@
           <w:iCs w:val="false"/>
         </w:rPr>
         <w:t xml:space="preserve">[14] B. Jayaraman and D. Evans, "Evaluating Differentially Private Machine Learning in Practice," USENIX Security, 2019.</w:t>
+      </w:r>
+    </w:p>
+    <w:p>
+      <w:pPr>
+        <w:spacing w:after="160"/>
+        <w:jc w:val="left"/>
+      </w:pPr>
+      <w:r>
+        <w:rPr>
+          <w:b w:val="false"/>
+          <w:bCs w:val="false"/>
+          <w:i w:val="false"/>
+          <w:iCs w:val="false"/>
+        </w:rPr>
+        <w:t xml:space="preserve">[15] M. A. Rahman, T. Rahman, R. Laganière, N. Mohammed, and Y. Wang, "Membership Inference Attack against Differentially Private Deep Learning Model," Transactions on Data Privacy, vol. 11, no. 1, pp. 61–79, 2018.</w:t>
       </w:r>
     </w:p>
     <w:p>

</xml_diff>

<commit_message>
Sprint 10zz+85: Rahman et al. — trade-off privacy-utilità (§2) + parallelo interpretabilità epsilon (§8 PES_v1), EN+IT
</commit_message>
<xml_diff>
--- a/docs/paper/ChargeShield-FL_DSN2027_paper_skeleton.docx
+++ b/docs/paper/ChargeShield-FL_DSN2027_paper_skeleton.docx
@@ -291,7 +291,7 @@
           <w:i w:val="false"/>
           <w:iCs w:val="false"/>
         </w:rPr>
-        <w:t xml:space="preserve">Differential privacy is defined to hide whether any single record participated in training, while membership inference attacks are defined to detect exactly that presence or absence — a direct conceptual opposition that Jayaraman and Evans [14] invoke to motivate empirical MIA auditing as the natural test of whether a DP guarantee holds in practice, rather than trusting the theoretical bound alone. They also provide the closest prior empirical measurement of the gap between differential privacy's theoretical guarantee (ε) and the leakage an actual attack extracts, finding that several relaxed DP notions reduce the noise needed for acceptable utility at a measurable cost in increased membership-inference leakage — concretely, Rényi DP (RDP) matches naive composition's utility at a 50× tighter budget (53% accuracy loss at ε=10 versus ε=500 for the same loss under naive composition) on a neural-network classification benchmark, yet a white-box membership-inference attacker still achieves 0.399 advantage against the RDP-trained model at ε=1000 — but only for centralized DP-SGD training on standard benchmarks. The naive-composition cost this gap describes can be extreme in practice: Rahman et al. [15] note that Shokri and Shmatikov’s distributed SGD mechanism, which perturbs gradients per-parameter, delivers only ε&gt;2 per parameter and — composed naively over roughly 300,000 parameters — a total ε exceeding 600,000, which they judge to provide no meaningful privacy guarantee at all. We perform the same class of measurement in a federated, cross-silo setting: three concrete DP placements ("dp-fedavg", "central", "local") evaluated against a Yeom/Shadow/LiRA attack hierarchy on real, organizationally-distinct EV-charging clients (ACN-Data), rather than a single centralized model on standard benchmark data. Where their measurements do find leakage in the configurations they test, ours instead returns a null result — no LiRA-detectable leakage at any placement or ε tested, including no DP — a harder finding to report responsibly, since an absent signal is also consistent with an insensitive measurement tool, not only with an absent privacy risk. We address this directly with the five-axis sanity check and canary-insertion positive control of §6, which rule out an insensitive attack harness as the explanation for the null result. Finally, our ML Plane and Privacy Auditor (§3) turn Jayaraman and Evans's central empirical question — does the theoretical guarantee actually hold in practice? — into a standing, reusable observability layer decoupled from the training loop, rather than a one-off measurement script: the same architecture that produced this paper's result can, without modification, be pointed at a different attack, dataset, or DP configuration to ask the same question again.</w:t>
+        <w:t xml:space="preserve">Differential privacy is defined to hide whether any single record participated in training, while membership inference attacks are defined to detect exactly that presence or absence — a direct conceptual opposition that Jayaraman and Evans [14] invoke to motivate empirical MIA auditing as the natural test of whether a DP guarantee holds in practice, rather than trusting the theoretical bound alone. They also provide the closest prior empirical measurement of the gap between differential privacy's theoretical guarantee (ε) and the leakage an actual attack extracts, finding that several relaxed DP notions reduce the noise needed for acceptable utility at a measurable cost in increased membership-inference leakage — concretely, Rényi DP (RDP) matches naive composition's utility at a 50× tighter budget (53% accuracy loss at ε=10 versus ε=500 for the same loss under naive composition) on a neural-network classification benchmark, yet a white-box membership-inference attacker still achieves 0.399 advantage against the RDP-trained model at ε=1000 — but only for centralized DP-SGD training on standard benchmarks. The naive-composition cost this gap describes can be extreme in practice: Rahman et al. [15] note that Shokri and Shmatikov’s distributed SGD mechanism, which perturbs gradients per-parameter, delivers only ε&gt;2 per parameter and — composed naively over roughly 300,000 parameters — a total ε exceeding 600,000, which they judge to provide no meaningful privacy guarantee at all. The same paper reports a complementary finding specifically for Abadi et al.’s DP-SGD (calibrated via the Moments Accountant): models configured for strong theoretical privacy (small ε) lose the utility a real deployment needs, while models configured for acceptable utility are vulnerable to membership inference at a level that, in their measurements, can approach that of a fully non-private model — the accuracy/privacy trade-off is not merely theoretical, it manifests as measurable leakage at the utility levels a deployment would actually choose. We perform the same class of measurement in a federated, cross-silo setting: three concrete DP placements ("dp-fedavg", "central", "local") evaluated against a Yeom/Shadow/LiRA attack hierarchy on real, organizationally-distinct EV-charging clients (ACN-Data), rather than a single centralized model on standard benchmark data. Where their measurements do find leakage in the configurations they test, ours instead returns a null result — no LiRA-detectable leakage at any placement or ε tested, including no DP — a harder finding to report responsibly, since an absent signal is also consistent with an insensitive measurement tool, not only with an absent privacy risk. We address this directly with the five-axis sanity check and canary-insertion positive control of §6, which rule out an insensitive attack harness as the explanation for the null result. Finally, our ML Plane and Privacy Auditor (§3) turn Jayaraman and Evans's central empirical question — does the theoretical guarantee actually hold in practice? — into a standing, reusable observability layer decoupled from the training loop, rather than a one-off measurement script: the same architecture that produced this paper's result can, without modification, be pointed at a different attack, dataset, or DP configuration to ask the same question again.</w:t>
       </w:r>
     </w:p>
     <w:p>
@@ -2297,6 +2297,21 @@
       </w:pPr>
       <w:r>
         <w:t xml:space="preserve">8. Privacy Exposure Score (PES_v1)</w:t>
+      </w:r>
+    </w:p>
+    <w:p>
+      <w:pPr>
+        <w:spacing w:after="160"/>
+        <w:jc w:val="both"/>
+      </w:pPr>
+      <w:r>
+        <w:rPr>
+          <w:b w:val="false"/>
+          <w:bCs w:val="false"/>
+          <w:i w:val="false"/>
+          <w:iCs w:val="false"/>
+        </w:rPr>
+        <w:t xml:space="preserve">ε alone is not interpretable, and this section exists because of that gap: Rahman et al. [15] motivate their own study by noting that differential privacy "has always been criticized for not being able to provide an intuitive explanation of the privacy parameter ε," and aim to give ε a concrete empirical meaning by measuring the membership-inference success it actually permits. PES_v1 pursues the same goal for this project: instead of reporting ε alone, it reports a single risk score that folds the nominal DP budget together with the residual attack advantage actually observed.</w:t>
       </w:r>
     </w:p>
     <w:p>

</xml_diff>

<commit_message>
Sprint 10zz+93: canary positive control esteso a Yeom/Shadow (Blocker 2), disclosure epsilon-budget auditor, riformulazione §4.2 paper (Byzantine=altro consumatore), design unificazione attack-surface, nuova roadmap prioritaria
</commit_message>
<xml_diff>
--- a/docs/paper/ChargeShield-FL_DSN2027_paper_skeleton.docx
+++ b/docs/paper/ChargeShield-FL_DSN2027_paper_skeleton.docx
@@ -519,7 +519,7 @@
           <w:i w:val="false"/>
           <w:iCs w:val="false"/>
         </w:rPr>
-        <w:t xml:space="preserve">We formalize five scenarios along a Purdue-model-inspired hierarchy of attacker capability. This paper's results are about Scenario 1 exclusively — every other scenario is explicitly out of scope and reported as such, not silently assumed away.</w:t>
+        <w:t xml:space="preserve">We formalize five scenarios along a Purdue-model-inspired hierarchy of attacker capability. This paper's results are about Scenario 1 exclusively — every other scenario is either handled by a separate consumer of the same ML Plane substrate and validated independently (Scenario 2, §4.2) or genuinely out of scope (Scenarios 3–4), reported as such and never silently assumed away.</w:t>
       </w:r>
     </w:p>
     <w:p>
@@ -552,22 +552,22 @@
         <w:spacing w:after="120" w:before="220"/>
       </w:pPr>
       <w:r>
-        <w:t xml:space="preserve">4.2 Scenarios 2–4 (out of scope, briefly)</w:t>
-      </w:r>
-    </w:p>
-    <w:p>
-      <w:pPr>
-        <w:spacing w:after="160"/>
-        <w:jc w:val="both"/>
-      </w:pPr>
-      <w:r>
-        <w:rPr>
-          <w:b w:val="false"/>
-          <w:bCs w:val="false"/>
-          <w:i w:val="false"/>
-          <w:iCs w:val="false"/>
-        </w:rPr>
-        <w:t xml:space="preserve">Scenario 2 (malicious FL client), Scenario 3 (compromised network gateway), and Scenario 4 (external passive eavesdropper, defeated by transport-layer security) are explicitly future work or out of scope by design — not evaluated here, and not conflated with Scenario 1 in our results.</w:t>
+        <w:t xml:space="preserve">4.2 Scenario 2 (a different consumer, not out of scope) and Scenarios 3–4 (out of scope)</w:t>
+      </w:r>
+    </w:p>
+    <w:p>
+      <w:pPr>
+        <w:spacing w:after="160"/>
+        <w:jc w:val="both"/>
+      </w:pPr>
+      <w:r>
+        <w:rPr>
+          <w:b w:val="false"/>
+          <w:bCs w:val="false"/>
+          <w:i w:val="false"/>
+          <w:iCs w:val="false"/>
+        </w:rPr>
+        <w:t xml:space="preserve">Scenario 2 (a malicious FL client) is not simply out of scope: as §3.3 argues, the ML Plane substrate has two consumers with orthogonal threat models over the same observability layer — the Privacy Auditor (confidentiality, Scenario 1, the subject of this paper’s results) and ByzantineDetector (integrity, Scenario 2). Scenario 2 belongs to that other consumer, is validated separately from the privacy claims in this paper, and is not conflated with Scenario 1 in our results. As of this submission, ByzantineDetector’s Krum/cosine-similarity/CUSUM mechanisms are implemented and unit-tested but have not yet been exercised end-to-end against an active Byzantine client on real FL training data — a gap we disclose explicitly rather than imply coverage we have not measured. Scenario 3 (compromised network gateway) and Scenario 4 (external passive eavesdropper, defeated by transport-layer security) remain genuinely out of scope: neither is an ML Plane consumer, and both are conventional network-security concerns orthogonal to Scenarios 1 and 2 alike.</w:t>
       </w:r>
     </w:p>
     <w:p>

</xml_diff>

<commit_message>
Sprint 10zz+94: rimozione framing gerarchia (paper EN+IT), reinquadramento Strada B come punti di osservazione (nuovo §3.4), gate sequencing floor/member_scoring nella roadmap, implementazione completa observation_surface (LiRA global + Yeom/Shadow client, opt-in, task #155)
</commit_message>
<xml_diff>
--- a/docs/paper/ChargeShield-FL_DSN2027_paper_skeleton.docx
+++ b/docs/paper/ChargeShield-FL_DSN2027_paper_skeleton.docx
@@ -82,7 +82,7 @@
           <w:i w:val="false"/>
           <w:iCs w:val="false"/>
         </w:rPr>
-        <w:t xml:space="preserve">Federated Learning (FL) is increasingly proposed for training shared models over critical infrastructure without centralizing raw data, but whether differential privacy (DP) applied at the FL communication channel actually prevents membership-inference leakage from the underlying computation remains an open empirical question. We present ChargeShield-FL, built around two domain-agnostic components — an event-driven ML Plane and a real-time Privacy Auditor — validated through a real electric-vehicle charging case study (ACN-Data, three real sites) using three DP placements and a Yeom/Shadow/LiRA attack hierarchy, in both simulation and a genuine multi-container NVFLARE/Containerlab deployment. Across every tested DP configuration, including no DP, we find no LiRA-detectable membership signal (composed AUC-ROC 0.4975–0.5024 across 10 configurations, 5 seeds each; 9 of 10 95% bootstrap CIs contain 0.5, the tenth — central, ε=0.1 — excludes it by a narrow margin without reaching Wilcoxon significance; confirmed with a real Wilcoxon signed-rank test). An extensive five-axis sanity check (training epochs, model capacity, feature informativeness, their combination, and training population) rules out an insensitive attack harness as the explanation. We report this null result, its statistical validation, and its implications for evaluating FL privacy claims in practice.</w:t>
+        <w:t xml:space="preserve">Federated Learning (FL) is increasingly proposed for training shared models over critical infrastructure without centralizing raw data, but whether differential privacy (DP) applied at the FL communication channel actually prevents membership-inference leakage from the underlying computation remains an open empirical question. We present ChargeShield-FL, built around two domain-agnostic components — an event-driven ML Plane and a real-time Privacy Auditor — validated through a real electric-vehicle charging case study (ACN-Data, three real sites) using three DP placements and three attacks spanning two independent observation surfaces — the aggregated global model (Yeom, Shadow) and each client’s individual per-round update (LiRA), in both simulation and a genuine multi-container NVFLARE/Containerlab deployment. Across every tested DP configuration, including no DP, we find no LiRA-detectable membership signal (composed AUC-ROC 0.4975–0.5024 across 10 configurations, 5 seeds each; 9 of 10 95% bootstrap CIs contain 0.5, the tenth — central, ε=0.1 — excludes it by a narrow margin without reaching Wilcoxon significance; confirmed with a real Wilcoxon signed-rank test). An extensive five-axis sanity check (training epochs, model capacity, feature informativeness, their combination, and training population) rules out an insensitive attack harness as the explanation. We report this null result, its statistical validation, and its implications for evaluating FL privacy claims in practice.</w:t>
       </w:r>
     </w:p>
     <w:p>
@@ -198,7 +198,7 @@
         <w:spacing w:after="90"/>
       </w:pPr>
       <w:r>
-        <w:t xml:space="preserve">An empirical case study on real, multi-site EV charging data (ACN-Data) and a genuine containerized NVFLARE/Containerlab deployment, evaluating three DP placements against a three-tier attack hierarchy (§5).</w:t>
+        <w:t xml:space="preserve">An empirical case study on real, multi-site EV charging data (ACN-Data) and a genuine containerized NVFLARE/Containerlab deployment, evaluating three DP placements against a three-attack suite spanning two independent observation surfaces (§5).</w:t>
       </w:r>
     </w:p>
     <w:p>
@@ -261,7 +261,7 @@
           <w:i w:val="false"/>
           <w:iCs w:val="false"/>
         </w:rPr>
-        <w:t xml:space="preserve">Membership inference attacks (MIA) were introduced by Shokri et al. [1] and formalized against the overfitting/loss-based connection by Yeom et al. [1a]; Carlini et al. [2] introduced the Likelihood-Ratio Attack (LiRA), the strongest of the three attacks in our hierarchy and the primary attack this paper's results are reported under. Nasr et al. [5] extend MIA analysis to the federated setting with active and passive white-box adversaries. Our threat model (§4) targets the passive, honest-but-curious aggregator — a weaker, more realistic capability than Nasr et al.'s active adversary, deliberately chosen to match a semi-trusted operator rather than a worst-case attacker.</w:t>
+        <w:t xml:space="preserve">Membership inference attacks (MIA) were introduced by Shokri et al. [1] and formalized against the overfitting/loss-based connection by Yeom et al. [1a]; Carlini et al. [2] introduced the Likelihood-Ratio Attack (LiRA), the most granular of our three attacks — the only one that observes a specific client’s per-round update rather than the aggregated global model — and the primary attack this paper's results are reported under. Nasr et al. [5] extend MIA analysis to the federated setting with active and passive white-box adversaries. Our threat model (§4) targets the passive, honest-but-curious aggregator — a weaker, more realistic capability than Nasr et al.'s active adversary, deliberately chosen to match a semi-trusted operator rather than a worst-case attacker.</w:t>
       </w:r>
     </w:p>
     <w:p>
@@ -291,7 +291,7 @@
           <w:i w:val="false"/>
           <w:iCs w:val="false"/>
         </w:rPr>
-        <w:t xml:space="preserve">Differential privacy is defined to hide whether any single record participated in training, while membership inference attacks are defined to detect exactly that presence or absence — a direct conceptual opposition that Jayaraman and Evans [14] invoke to motivate empirical MIA auditing as the natural test of whether a DP guarantee holds in practice, rather than trusting the theoretical bound alone. They also provide the closest prior empirical measurement of the gap between differential privacy's theoretical guarantee (ε) and the leakage an actual attack extracts, finding that several relaxed DP notions reduce the noise needed for acceptable utility at a measurable cost in increased membership-inference leakage — concretely, Rényi DP (RDP) matches naive composition's utility at a 50× tighter budget (53% accuracy loss at ε=10 versus ε=500 for the same loss under naive composition) on a neural-network classification benchmark, yet a white-box membership-inference attacker still achieves 0.399 advantage against the RDP-trained model at ε=1000 — but only for centralized DP-SGD training on standard benchmarks. The naive-composition cost this gap describes can be extreme in practice: Rahman et al. [15] note that Shokri and Shmatikov’s distributed SGD mechanism, which perturbs gradients per-parameter, delivers only ε&gt;2 per parameter and — composed naively over roughly 300,000 parameters — a total ε exceeding 600,000, which they judge to provide no meaningful privacy guarantee at all. The same paper reports a complementary finding specifically for Abadi et al.’s DP-SGD (calibrated via the Moments Accountant): models configured for strong theoretical privacy (small ε) lose the utility a real deployment needs, while models configured for acceptable utility are vulnerable to membership inference at a level that, in their measurements, can approach that of a fully non-private model — the accuracy/privacy trade-off is not merely theoretical, it manifests as measurable leakage at the utility levels a deployment would actually choose. We perform the same class of measurement in a federated, cross-silo setting: three concrete DP placements ("dp-fedavg", "central", "local") evaluated against a Yeom/Shadow/LiRA attack hierarchy on real, organizationally-distinct EV-charging clients (ACN-Data), rather than a single centralized model on standard benchmark data. Where their measurements do find leakage in the configurations they test, ours instead returns a null result — no LiRA-detectable leakage at any placement or ε tested, including no DP — a harder finding to report responsibly, since an absent signal is also consistent with an insensitive measurement tool, not only with an absent privacy risk. We address this directly with the five-axis sanity check and canary-insertion positive control of §6, which rule out an insensitive attack harness as the explanation for the null result. Finally, our ML Plane and Privacy Auditor (§3) turn Jayaraman and Evans's central empirical question — does the theoretical guarantee actually hold in practice? — into a standing, reusable observability layer decoupled from the training loop, rather than a one-off measurement script: the same architecture that produced this paper's result can, without modification, be pointed at a different attack, dataset, or DP configuration to ask the same question again.</w:t>
+        <w:t xml:space="preserve">Differential privacy is defined to hide whether any single record participated in training, while membership inference attacks are defined to detect exactly that presence or absence — a direct conceptual opposition that Jayaraman and Evans [14] invoke to motivate empirical MIA auditing as the natural test of whether a DP guarantee holds in practice, rather than trusting the theoretical bound alone. They also provide the closest prior empirical measurement of the gap between differential privacy's theoretical guarantee (ε) and the leakage an actual attack extracts, finding that several relaxed DP notions reduce the noise needed for acceptable utility at a measurable cost in increased membership-inference leakage — concretely, Rényi DP (RDP) matches naive composition's utility at a 50× tighter budget (53% accuracy loss at ε=10 versus ε=500 for the same loss under naive composition) on a neural-network classification benchmark, yet a white-box membership-inference attacker still achieves 0.399 advantage against the RDP-trained model at ε=1000 — but only for centralized DP-SGD training on standard benchmarks. The naive-composition cost this gap describes can be extreme in practice: Rahman et al. [15] note that Shokri and Shmatikov’s distributed SGD mechanism, which perturbs gradients per-parameter, delivers only ε&gt;2 per parameter and — composed naively over roughly 300,000 parameters — a total ε exceeding 600,000, which they judge to provide no meaningful privacy guarantee at all. The same paper reports a complementary finding specifically for Abadi et al.’s DP-SGD (calibrated via the Moments Accountant): models configured for strong theoretical privacy (small ε) lose the utility a real deployment needs, while models configured for acceptable utility are vulnerable to membership inference at a level that, in their measurements, can approach that of a fully non-private model — the accuracy/privacy trade-off is not merely theoretical, it manifests as measurable leakage at the utility levels a deployment would actually choose. We perform the same class of measurement in a federated, cross-silo setting: three concrete DP placements ("dp-fedavg", "central", "local") evaluated against three attacks spanning two independent observation surfaces on real, organizationally-distinct EV-charging clients (ACN-Data), rather than a single centralized model on standard benchmark data. Where their measurements do find leakage in the configurations they test, ours instead returns a null result — no LiRA-detectable leakage at any placement or ε tested, including no DP — a harder finding to report responsibly, since an absent signal is also consistent with an insensitive measurement tool, not only with an absent privacy risk. We address this directly with the five-axis sanity check and canary-insertion positive control of §6, which rule out an insensitive attack harness as the explanation for the null result. Finally, our ML Plane and Privacy Auditor (§3) turn Jayaraman and Evans's central empirical question — does the theoretical guarantee actually hold in practice? — into a standing, reusable observability layer decoupled from the training loop, rather than a one-off measurement script: the same architecture that produced this paper's result can, without modification, be pointed at a different attack, dataset, or DP configuration to ask the same question again.</w:t>
       </w:r>
     </w:p>
     <w:p>
@@ -321,7 +321,7 @@
           <w:i w:val="false"/>
           <w:iCs w:val="false"/>
         </w:rPr>
-        <w:t xml:space="preserve">ChargeShield-FL specializes and extends a prior architectural proposal, Imperatrice &amp; Romano [12], which introduces the ML Plane abstraction and the honest-but-curious-aggregator threat model for a generic Smart Grid/OT intrusion-detection testbed, with FedMIA experiments reported as not yet completed. This paper turns that architecture into a concrete, real-data EV-charging deployment: three real DP placements (vs. one), a three-tier attack hierarchy including LiRA (vs. a single FedMIA variant), a defensive IDS layer, and — critically — completed, independently re-verified empirical results on both simulation and a real multi-container deployment.</w:t>
+        <w:t xml:space="preserve">ChargeShield-FL specializes and extends a prior architectural proposal, Imperatrice &amp; Romano [12], which introduces the ML Plane abstraction and the honest-but-curious-aggregator threat model for a generic Smart Grid/OT intrusion-detection testbed, with FedMIA experiments reported as not yet completed. This paper turns that architecture into a concrete, real-data EV-charging deployment: three real DP placements (vs. one), a three-attack suite spanning two independent observation surfaces, including LiRA (vs. a single FedMIA variant), a defensive IDS layer, and — critically — completed, independently re-verified empirical results on both simulation and a real multi-container deployment.</w:t>
       </w:r>
     </w:p>
     <w:p>
@@ -456,6 +456,21 @@
           <w:i w:val="false"/>
           <w:iCs w:val="false"/>
         </w:rPr>
+        <w:t xml:space="preserve">Read this way, the three placements are not three independent privacy mechanisms but three points of adversary privilege along the same per-client update's transformation pipeline: dp-fedavg observes it raw, before any clipping or noising; central observes it after client-side clipping but before any noise; local observes only the final clipped-and-noised value — never the raw or intermediate one, not even transiently. Under this reading, dp-fedavg is not one privacy mechanism among three that happens to provide no protection: it is the ceiling of what is extractable from this channel at all, under the most privileged view our architecture ever grants an aggregator. Should that ceiling itself show no detectable membership signal (§7), the same null result under the two protective placements, central and local, cannot be attributed to DP noise suppressing a signal that was otherwise present — the unprotected, raw view would already have contained none to suppress. This is also the point at which the ML Plane substrate (§3.1) is load-bearing for the experiment, not merely infrastructure: its event stream — local update produced, update privatized, round aggregated — is exactly what makes these three levels of aggregator privilege separately observable and separately attackable in the first place.</w:t>
+      </w:r>
+    </w:p>
+    <w:p>
+      <w:pPr>
+        <w:spacing w:after="160"/>
+        <w:jc w:val="both"/>
+      </w:pPr>
+      <w:r>
+        <w:rPr>
+          <w:b w:val="false"/>
+          <w:bCs w:val="false"/>
+          <w:i w:val="false"/>
+          <w:iCs w:val="false"/>
+        </w:rPr>
         <w:t xml:space="preserve">A further caveat applies specifically to how ε should be read in this paper. The formal (ε,δ)-DP guarantee for a clip-and-noise mechanism holds cleanly when each client contributes one gradient step per round (as in DP-SGD); our clients instead run local_epochs=50 local optimizer steps per round before their update is clipped and noised once. At the client-level granularity these placements are calibrated to (the unit McMahan et al. protect, per §3.4 above), this does not weaken the guarantee: the clip bounds the per-round contribution of the whole client regardless of how many local steps produced it. We flag it nonetheless because it is easy to conflate with the record-level question this paper actually asks (whether LiRA can detect a single session): the 50-epoch local training regime described in §5 is what gives the model the opportunity to memorize a single session in the first place, and ε here is best read as an experimental noise parameter calibrated to the client-level unit, not as a formal per-record privacy budget.</w:t>
       </w:r>
     </w:p>
@@ -630,7 +645,7 @@
           <w:i w:val="false"/>
           <w:iCs w:val="false"/>
         </w:rPr>
-        <w:t xml:space="preserve">Attack hierarchy: Yeom [1a] (loss-based, global), a calibrated Shadow-Model attack [1], and LiRA [2] (likelihood-ratio, server-side, evaluated on each client's per-round update as actually submitted for aggregation — LiRA is the primary attack this paper reports results under, as the strongest of the three).</w:t>
+        <w:t xml:space="preserve">Attack suite across two observation surfaces: Yeom [1a] (loss-based) and a calibrated Shadow-Model attack [1] both observe only the aggregated global model — from this vantage point, a positive detection can conclude only that some session, somewhere in the federation, was a training member, never which client trained on it. LiRA [2] (likelihood-ratio) instead observes a specific client's individual per-round update as actually submitted for aggregation — a strictly more privileged vantage point, since it requires the aggregator to inspect a named client's contribution rather than the pooled result, and a positive detection would attribute membership to that specific operator. These are not three points on one scale of attack strength: they are two independent observation surfaces testing two different claims, and LiRA is the primary attack this paper reports results under because it is the one that matches the aggregator's actual privilege in our threat model (§4.1), not because it subsumes the other two.</w:t>
       </w:r>
     </w:p>
     <w:p>
@@ -1991,7 +2006,7 @@
           <w:i w:val="false"/>
           <w:iCs w:val="false"/>
         </w:rPr>
-        <w:t xml:space="preserve">Table 2 above reports LiRA only, the primary attack. Yeom (2018) and Shadow MIA, the two weaker attacks run in every configuration alongside LiRA, show the same pattern: across all ten nominal configurations, both attacks’ mean AUC-ROC (5 seeds, per-round average — neither attack has a “composed” cross-round statistic analogous to LiRA’s) stays within bootstrap-CI distance of chance, with no exception.</w:t>
+        <w:t xml:space="preserve">Table 2 above reports LiRA only. Yeom (2018) and Shadow MIA attack a different observation surface — the aggregated global model, from which a positive result could only mean that some session was a training member somewhere in the federation, never that a specific client trained on it, the granularity LiRA alone can reach (§5) — run in every configuration alongside LiRA, and show the same pattern: across all ten nominal configurations, both attacks’ mean AUC-ROC (5 seeds, per-round average — neither attack has a “composed” cross-round statistic analogous to LiRA’s) stays within bootstrap-CI distance of chance, with no exception. Because the two surfaces are independent rather than nested, this is not three redundant readings of the same measurement: a null on the aggregate-model surface does not follow logically from a null on the per-client-update surface, or vice versa. Two independent surfaces both returning null is accordingly a broader claim than either alone — no detectable leakage from an attacker who can only see the pooled result, and none from an attacker privileged enough to see one client's individual contribution.</w:t>
       </w:r>
     </w:p>
     <w:tbl>

</xml_diff>

<commit_message>
Sprint 10zz+100: documentata nel paper (EN+IT, §6.2+§9) la scoperta Blocker 2 — estensione canary a Yeom/Shadow, inversione di Shadow diagnosticata come limite di calibrazione (non bug), fix inject_canaries() e suo effetto su LiRA (0.6875→0.66)
</commit_message>
<xml_diff>
--- a/docs/paper/ChargeShield-FL_DSN2027_paper_skeleton.docx
+++ b/docs/paper/ChargeShield-FL_DSN2027_paper_skeleton.docx
@@ -1232,6 +1232,21 @@
           <w:iCs w:val="false"/>
         </w:rPr>
         <w:t xml:space="preserve">The two rows above come from two separate single-seed runs of the same protocol rather than one shared run, so they should not be read as a before/after comparison on identical canaries: run A additionally reports a calibrated LiRA AUC of 0.4863 / 0.6265 / 0.4250 (composed 0.5534), and run B reports a raw reconstruction-loss AUC of 0.6625 / 0.85 / 0.8375 — both broadly consistent with the table's figures, but we show the stronger single realization of each metric rather than averaging across runs we did not design to be pooled. Site coverage for the raw-loss signal is uneven, contrary to an earlier draft of this section that described it as holding at every site tested: at Office 1, raw reconstruction loss cleanly separates canary members from non-members in every round (as in the table). At Caltech, the same protocol produces an AUC of 0.3710 / 0.3805 / 0.4236 — inverted, below chance, not qualitatively similar separation. At JPL, raw-loss AUC is 0.4737 / 0.4632 / 0.4947 — at chance. The raw-loss positive control therefore succeeds unambiguously only at Office 1 among the three sites; we do not yet have an explanation for the sign flip at Caltech and report it as an open question rather than omit it. The calibrated LiRA score is more nuanced still. After fixing a shadow-sampling contamination bug (duplicate canary copies could previously fragment across a single shadow's IN/OUT split, diluting the differential signal LiRA's calibration relies on), calibrated LiRA on the Office 1 canaries (run B, ≈11% of that client's training set) detects the canary consistently across all three rounds (0.6375 / 0.6625 / 0.5875, composed 0.6875), above the 0.60 working threshold used in §6.1 — though, as elsewhere in this section, this is a single-seed/3-round result, not replicated across seeds. It remains systematically weaker than the raw-loss signal, which we attribute to a separate, still-open limitation: LiRA's Gaussian calibration operates at its per-shadow variance floor in 96–99% of cases in this run rather than on genuine per-shadow variance (§3.5, §9). Replicating the identical protocol at Caltech and JPL — where aggregate duplicate density is far lower (≈0.5% of local training data, since both clients have larger local datasets than Office 1) — does not reproduce the calibrated-LiRA signal (Caltech composed AUC 0.42–0.50; JPL composed AUC 0.5368). We attempted to isolate density from site by re-running the canary insertion at Caltech with aggregate duplicate density matched to Office 1's (≈10% of local training data, n_templates=84, n_duplicates=30): calibrated LiRA still failed to detect the canary (AUC 0.46–0.53, near or below chance). We had read this as evidence that duplicate density alone does not explain the Office 1/Caltech gap, but on closer inspection the two configurations do not match on the variable that plausibly drives memorization: Office 1 duplicates each of 5 templates 30× into a ≈1,680-session pool (≈2.0% per-record amplification), while the density-matched Caltech configuration duplicates each of 84 templates 30× into a ≈25,123-session pool (≈0.12% per-record amplification) — a 17× difference in per-record amplification despite matched aggregate density. Aggregate density and per-record amplification are not the same quantity, and the experiment as run confounds them; the Caltech result above should therefore be read as inconclusive on the density question, not as evidence against it. A cleaner test would hold n_templates=5 fixed (as at Office 1) and raise n_duplicates at Caltech until per-record amplification, rather than aggregate density, matches Office 1's; we did not have time to run this before submission and flag it as the natural next experiment. In every case this is a property of LiRA's calibration under an artificial near-duplicate-record design; natural EV sessions in our dataset are never literal duplicates of one another, so none of this extends to, or undermines, the null result in §7.</w:t>
+      </w:r>
+    </w:p>
+    <w:p>
+      <w:pPr>
+        <w:spacing w:after="160"/>
+        <w:jc w:val="both"/>
+      </w:pPr>
+      <w:r>
+        <w:rPr>
+          <w:b w:val="false"/>
+          <w:bCs w:val="false"/>
+          <w:i w:val="false"/>
+          <w:iCs w:val="false"/>
+        </w:rPr>
+        <w:t xml:space="preserve">Blocker 2 (2026-09-15) extended this positive control to the other two attacks used throughout the paper, Yeom and Shadow, on the same Office 1 protocol (no-DP, seed 42, 3 rounds) — addressing a reviewer-relevant gap: a null result reported across three attacks is only as strong as the weakest attack's demonstrated ability to detect a real leak. Yeom — which reads raw reconstruction loss under the aggregated global model directly, with no shadow calibration — detects the canary as strongly as the raw-loss row above (AUC 0.70 / 0.86 / 0.86 across the three rounds), confirming that duplication-induced memorization is visible from the global-model observation surface as well as from LiRA's per-client view. Shadow's calibrated score (shadow-model loss minus target-model loss) is instead inverted (AUC 0.21–0.32 across three independent runs of this diagnosis, including after closing a template-tagging gap in the canary injection itself, discussed below), and per-canary-group diagnostics (mean calibrated score per template) rule out sampling variance as the cause: all five templates are consistently below the non-member average in every round. Since Yeom's absolute target-model loss on the same canaries — read from the identical trained model — is confirmed low, insufficient memorization cannot explain the inversion; the more likely cause is that both the shadow and target models, on this small (570-parameter, six-feature) architecture, converge close to a shared reconstruction-error floor for in-distribution Office 1 sessions, so the shadow-minus-target difference for the five templates is dominated by each template's idiosyncratic reconstruction difficulty rather than by membership. We report this as an open limitation specific to Shadow's calibration under this artificial small-template design, not as evidence against Shadow's role in the main campaign's null result (§7), where it reports raw AUC values unaffected by this analysis. A related fix was applied during this investigation: the real session chosen as each canary template was, until fixed, left untagged in the training pool alongside its 30 tagged duplicates — invisible to the guard that excludes canary sessions from Shadow's own shadow-model training split. Tagging it closed a genuine isolation gap (it also affects LiRA's shadow-universe sampling, discussed above) and lowered LiRA's composed canary AUC slightly, from 0.6875 to 0.66, without changing the qualitative result.</w:t>
       </w:r>
     </w:p>
     <w:p>
@@ -3827,7 +3842,7 @@
         <w:spacing w:after="90"/>
       </w:pPr>
       <w:r>
-        <w:t xml:space="preserve">A positive control was obtained via canary insertion (§6.2): the raw reconstruction loss detects it at every site tested (AUC 0.70–0.90 at Office 1); the calibrated LiRA score detects it reliably only at Office 1 (composed AUC 0.6875, after fixing a shadow-sampling contamination bug), and fails to reproduce the signal at Caltech/JPL even when duplicate density is matched to Office 1's (≈10%) — a site-dependence in LiRA's calibration under this artificial near-duplicate design that is only partially understood, not evidence against the harness's underlying sensitivity or against the natural-data null result in §7.</w:t>
+        <w:t xml:space="preserve">A positive control was obtained via canary insertion (§6.2): the raw reconstruction loss detects it at every site tested (AUC 0.70–0.90 at Office 1); the calibrated LiRA score detects it reliably only at Office 1 (composed AUC 0.66, after fixing two shadow-sampling contamination bugs), and fails to reproduce the signal at Caltech/JPL even when duplicate density is matched to Office 1's (≈10%) — a site-dependence in LiRA's calibration under this artificial near-duplicate design that is only partially understood, not evidence against the harness's underlying sensitivity or against the natural-data null result in §7. Yeom independently confirms harness sensitivity at Office 1 (canary AUC 0.70–0.86, reading raw target-model loss with no shadow calibration); Shadow's calibrated canary score is instead inverted there (AUC 0.21–0.32), traced to a shared reconstruction-error floor between its shadow and target models at this model scale rather than to insufficient memorization (§6.2) — a limitation of that attack's calibration under this specific positive-control design, not of the underlying null result.</w:t>
       </w:r>
     </w:p>
     <w:p>

</xml_diff>

<commit_message>
Sprint 10zz+103: nuova sez. 3.3 Empirical Auditing of DP (EN+IT) - adversary instantiation, one-run auditing, canary federated-specific
</commit_message>
<xml_diff>
--- a/docs/paper/ChargeShield-FL_DSN2027_paper_skeleton.docx
+++ b/docs/paper/ChargeShield-FL_DSN2027_paper_skeleton.docx
@@ -198,7 +198,7 @@
         <w:spacing w:after="90"/>
       </w:pPr>
       <w:r>
-        <w:t xml:space="preserve">An empirical case study on real, multi-site EV charging data (ACN-Data) and a genuine containerized NVFLARE/Containerlab deployment, evaluating three DP placements against a three-attack suite spanning two independent observation surfaces (§5).</w:t>
+        <w:t xml:space="preserve">Empirical auditing of differential privacy (§3.3) via three adversary-instantiated attacks of increasing strength and a single-run, federated-specific canary positive control, explicitly related to and scoped against the adversary-instantiation [16,17], one-run auditing [18], and federated-canary [19] literature.</w:t>
       </w:r>
     </w:p>
     <w:p>
@@ -211,7 +211,7 @@
         <w:spacing w:after="90"/>
       </w:pPr>
       <w:r>
-        <w:t xml:space="preserve">A rigorously validated null result — no LiRA-detectable leakage under any tested DP configuration — supported by bootstrap confidence intervals, a Wilcoxon/sign-test significance check, and TPR@low-FPR reporting (§7).</w:t>
+        <w:t xml:space="preserve">An empirical case study on real, multi-site EV charging data (ACN-Data) and a genuine containerized NVFLARE/Containerlab deployment, evaluating three DP placements against a three-attack suite spanning two independent observation surfaces (§5).</w:t>
       </w:r>
     </w:p>
     <w:p>
@@ -224,7 +224,7 @@
         <w:spacing w:after="90"/>
       </w:pPr>
       <w:r>
-        <w:t xml:space="preserve">An extensive five-axis sanity-check methodology (§6) that distinguishes "the attack harness cannot detect memorization" from "this architecture genuinely does not leak at this scale" — itself a reusable validation pattern for null MIA results in FL privacy research.</w:t>
+        <w:t xml:space="preserve">A rigorously validated null result — no LiRA-detectable leakage under any tested DP configuration — supported by bootstrap confidence intervals, a Wilcoxon/sign-test significance check, and TPR@low-FPR reporting (§7).</w:t>
       </w:r>
     </w:p>
     <w:p>
@@ -237,6 +237,19 @@
         <w:spacing w:after="90"/>
       </w:pPr>
       <w:r>
+        <w:t xml:space="preserve">An extensive five-axis sanity-check methodology (§6) that distinguishes "the attack harness cannot detect memorization" from "this architecture genuinely does not leak at this scale" — itself a reusable validation pattern for null MIA results in FL privacy research.</w:t>
+      </w:r>
+    </w:p>
+    <w:p>
+      <w:pPr>
+        <w:pStyle w:val="ListParagraph"/>
+        <w:numPr>
+          <w:ilvl w:val="0"/>
+          <w:numId w:val="1"/>
+        </w:numPr>
+        <w:spacing w:after="90"/>
+      </w:pPr>
+      <w:r>
         <w:t xml:space="preserve">PES_v1 (§8), a composite privacy exposure score combining residual attack advantage and nominal DP budget, with an informal theoretical grounding against the Yeom (2018) / Humphries et al. (2020) membership-advantage bounds.</w:t>
       </w:r>
     </w:p>
@@ -306,6 +319,21 @@
           <w:i w:val="false"/>
           <w:iCs w:val="false"/>
         </w:rPr>
+        <w:t xml:space="preserve">A distinct, more recent line of work treats empirical DP auditing itself as the object of study rather than a one-off measurement. Jagielski et al. [16] audit DP-SGD via data-poisoning canaries inserted before training, deriving empirical lower bounds on ε from how reliably an adversary distinguishes a poisoned model from a clean one; Nasr et al. [17] generalize this into “adversary instantiation” — replacing the abstract worst-case DP game with a concretely instantiated membership-inference adversary run against a real trained model, exactly the role our Yeom/Shadow/LiRA suite plays in this paper (§3.3); and Steinke et al. [18] show that auditing can be done from a single training run rather than the hundreds of independent IN/OUT runs classical audits require, by inserting many independent canaries together and exploiting their independence directly rather than via group privacy. In the federated setting specifically, Maddock et al.’s CANIFE [19] crafts per-round, gradient-orthogonal canaries under a strong adversary with access to intermediate client updates, converting a per-round separation measure into an RDP-composed (ε,δ) bound. Our own canary positive control (§3.3, §6.2) sits in the same family — single training run, multiple inserted canary groups, federated client boundaries — but is deliberately weaker and narrower in scope than any of [16]–[19]: it uses naturally-occurring duplicated records rather than optimized adversarial inputs, and it reports a detection-sensitivity check (can the harness detect an amplified real leak at all) rather than a formal empirical ε lower bound. We declare this gap explicitly in §3.3 and §9 rather than overstate what our canaries establish.</w:t>
+      </w:r>
+    </w:p>
+    <w:p>
+      <w:pPr>
+        <w:spacing w:after="160"/>
+        <w:jc w:val="both"/>
+      </w:pPr>
+      <w:r>
+        <w:rPr>
+          <w:b w:val="false"/>
+          <w:bCs w:val="false"/>
+          <w:i w:val="false"/>
+          <w:iCs w:val="false"/>
+        </w:rPr>
         <w:t xml:space="preserve">Byzantine-robust aggregation (Krum [9], and CUSUM/cosine-similarity variants) is used in our ByzantineDetector defense layer, but — as we argue explicitly in §4 — belongs to a formally separate threat domain (client-side integrity, Scenario 2) from the privacy question this paper answers (server-side passive observation, Scenario 1); no integrity mechanism is claimed to mitigate MIA here, correcting a conflation we found and rejected during our own review process (see §4.3).</w:t>
       </w:r>
     </w:p>
@@ -402,22 +430,52 @@
         <w:spacing w:after="120" w:before="220"/>
       </w:pPr>
       <w:r>
-        <w:t xml:space="preserve">3.3 ByzantineDetector: a formally separate integrity domain</w:t>
-      </w:r>
-    </w:p>
-    <w:p>
-      <w:pPr>
-        <w:spacing w:after="160"/>
-        <w:jc w:val="both"/>
-      </w:pPr>
-      <w:r>
-        <w:rPr>
-          <w:b w:val="false"/>
-          <w:bCs w:val="false"/>
-          <w:i w:val="false"/>
-          <w:iCs w:val="false"/>
-        </w:rPr>
-        <w:t xml:space="preserve">ByzantineDetector (Krum, cosine-similarity, CUSUM, gradient-explosion detection) protects FL convergence against Byzantine/poisoning clients — a client-side integrity concern (Scenario 2 in our threat model, §4). We state explicitly, having found and corrected our own earlier conflation of this point during development: no IDS mechanism provides any privacy guarantee against the honest-but-curious server this paper's MIA results are about. Integrity and privacy are two orthogonal domains in this architecture; ByzantineDetector is never cited here as an MIA defense, active or passive.</w:t>
+        <w:t xml:space="preserve">3.3 Empirical Auditing of Differential Privacy</w:t>
+      </w:r>
+    </w:p>
+    <w:p>
+      <w:pPr>
+        <w:spacing w:after="160"/>
+        <w:jc w:val="both"/>
+      </w:pPr>
+      <w:r>
+        <w:rPr>
+          <w:b w:val="false"/>
+          <w:bCs w:val="false"/>
+          <w:i w:val="false"/>
+          <w:iCs w:val="false"/>
+        </w:rPr>
+        <w:t xml:space="preserve">Differential privacy’s (ε,δ) guarantee bounds worst-case leakage over every possible adversary and neighboring dataset; it does not by itself say what a concrete, realistic adversary actually extracts from one specific trained model. A distinct methodology — empirically instantiating one or more concrete membership-inference adversaries against a real model and measuring what they achieve, rather than reasoning about the DP game in the abstract — is what Jagielski et al. [16] and Nasr et al. [17] call adversary instantiation. This is precisely the role Yeom, Shadow, and LiRA (§3.6) play in this paper: three adversary instantiations of increasing strength — a raw-loss threshold, a single calibrated shadow model, and an ensemble likelihood-ratio test — run offline against real per-round training data (§5–§7), entirely separate from the Privacy Auditor’s (§3.2) online budget accounting. We keep this distinction terminologically explicit because the DP-auditing literature’s own use of “auditor” [16–18] refers to this adversary/measurement role, not to our Privacy Auditor component: the Privacy Auditor computes what the DP mechanism promises; Yeom/Shadow/LiRA measure what an instantiated adversary actually extracts. We use “empirical auditing of differential privacy” for this section’s methodology throughout, reserving “the Privacy Auditor” exclusively for the defensive telemetry subsystem of §3.2.</w:t>
+      </w:r>
+    </w:p>
+    <w:p>
+      <w:pPr>
+        <w:spacing w:after="160"/>
+        <w:jc w:val="both"/>
+      </w:pPr>
+      <w:r>
+        <w:rPr>
+          <w:b w:val="false"/>
+          <w:bCs w:val="false"/>
+          <w:i w:val="false"/>
+          <w:iCs w:val="false"/>
+        </w:rPr>
+        <w:t xml:space="preserve">Classical empirical DP audits, like classical MIA evaluations, typically require training many independent models under paired IN/OUT hypotheses to obtain a distribution of a test statistic — a cost that is prohibitive for cross-silo FL on real, multi-hour training runs (§5) at the scale this project can repeat within its deadline. Steinke et al. [18] address exactly this cost, showing that a single training run, seeded with many independent canaries whose inclusion/exclusion is guessed individually, yields a valid empirical lower bound on ε via a direct independence argument rather than group privacy — hundreds of models are no longer required. Our canary positive control (§6.2) is single-run in the same practical sense: one training run per configuration, five canary groups inserted together rather than sequentially. We stop short, however, of Steinke et al.’s actual contribution: we do not derive a numerical (ε,δ) lower bound from the canary scores. We use them only as a binary sensitivity check — whether the attack harness detects an artificially amplified, known real leak at all (canary AUC-ROC/advantage vs. the non-canary population) — which is the question §6.2 and §9 already report answers to. Extending this single-run canary design into a formal empirical ε lower bound in the style of [18] is future work, not a claim this paper makes.</w:t>
+      </w:r>
+    </w:p>
+    <w:p>
+      <w:pPr>
+        <w:spacing w:after="160"/>
+        <w:jc w:val="both"/>
+      </w:pPr>
+      <w:r>
+        <w:rPr>
+          <w:b w:val="false"/>
+          <w:bCs w:val="false"/>
+          <w:i w:val="false"/>
+          <w:iCs w:val="false"/>
+        </w:rPr>
+        <w:t xml:space="preserve">A canary injected into one federated client’s local training set must additionally survive that client’s local optimizer, the FedAvg aggregation step, and — for LiRA specifically — shadow-model calibration, without leaking across the cluster boundary that defines which client it belongs to. inject_canaries() (§6.2) resolves this via each session’s real site_id rather than list position, and a dedicated atomic-group sampling guard keeps every duplicate of a canary group together whenever shadow-training subsets are resampled, so a canary group is never silently split between a shadow model’s IN and OUT partitions. Maddock et al.’s CANIFE [19] is the closest prior FL-specific canary construction: it crafts adversarial, gradient-orthogonal canary inputs adaptively every round, under a strong adversary that observes intermediate client updates, and composes a per-round separation measure into an RDP-based (ε,δ) bound across the whole run. Our canaries are constructed far more simply and are declared as such: real, unmodified charging sessions from the target site, duplicated at a controlled multiplicity computed to match a reference site’s per-record amplification (§6.2), injected once before training rather than adaptively per round, and scored only as a positive-control detection rate rather than an RDP-composable measure. This answers a narrower question than CANIFE’s or [18]’s — can this attack harness detect a real, deliberately amplified leak in this federated setting at all — which is what this paper needs to interpret its near-null results elsewhere (§7, §9) as an absent risk rather than an insensitive measurement tool, not what the tightest empirical ε this deployment leaks would be, which we leave to future work.</w:t>
       </w:r>
     </w:p>
     <w:p>
@@ -426,52 +484,22 @@
         <w:spacing w:after="120" w:before="220"/>
       </w:pPr>
       <w:r>
-        <w:t xml:space="preserve">3.4 Three Differential-Privacy Placements</w:t>
-      </w:r>
-    </w:p>
-    <w:p>
-      <w:pPr>
-        <w:spacing w:after="160"/>
-        <w:jc w:val="both"/>
-      </w:pPr>
-      <w:r>
-        <w:rPr>
-          <w:b w:val="false"/>
-          <w:bCs w:val="false"/>
-          <w:i w:val="false"/>
-          <w:iCs w:val="false"/>
-        </w:rPr>
-        <w:t xml:space="preserve">We evaluate three placements of client-update clipping and Gaussian noising relative to FedAvg aggregation: dp-fedavg (per-client clip + noise before aggregation — the server transiently observes the raw update, which is exactly what LiRA is built to attack); central (client-side clip only, a single aggregate-level noise draw post-FedAvg — matches McMahan et al.'s [3] Algorithm 1 literally; individual client contributions are never noised); and local (per-client clip + noise, with the raw update never transmitted to or observed by the server, not even transiently). Our own composition accounting across FL rounds is naive, not RDP-based (§9); the gap Jayaraman and Evans document between naive and tighter composition is exactly why our reported multi-round privacy budget should be read as a conservative upper bound, not a tight guarantee. All three placements clip and noise at client granularity: the unit of protection is a client's per-round contribution as a whole — the notion McMahan et al. [3] formalize as client-level DP — not per-example DP-SGD (Abadi et al. [7]), which instead bounds the influence of a single training record. LiRA targets exactly that finer granularity: it asks whether one specific charging session, inside one client's local training set, can be detected as a member. None of our three placements is calibrated to bound a single record's contribution to its client's local training, so client-level clipping provides no formal guarantee at the granularity LiRA actually attacks. Our result is therefore an empirical measurement of whether a record-level attacker finds detectable leakage under a client-level DP configuration, not a claim that client-level DP formally protects individual sessions — the same gap between theoretical guarantee and empirical attack surface that motivates this paper's central question (§1).</w:t>
-      </w:r>
-    </w:p>
-    <w:p>
-      <w:pPr>
-        <w:spacing w:after="160"/>
-        <w:jc w:val="both"/>
-      </w:pPr>
-      <w:r>
-        <w:rPr>
-          <w:b w:val="false"/>
-          <w:bCs w:val="false"/>
-          <w:i w:val="false"/>
-          <w:iCs w:val="false"/>
-        </w:rPr>
-        <w:t xml:space="preserve">Read this way, the three placements are not three independent privacy mechanisms but three points of adversary privilege along the same per-client update's transformation pipeline: dp-fedavg observes it raw, before any clipping or noising; central observes it after client-side clipping but before any noise; local observes only the final clipped-and-noised value — never the raw or intermediate one, not even transiently. Under this reading, dp-fedavg is not one privacy mechanism among three that happens to provide no protection: it is the ceiling of what is extractable from this channel at all, under the most privileged view our architecture ever grants an aggregator. Should that ceiling itself show no detectable membership signal (§7), the same null result under the two protective placements, central and local, cannot be attributed to DP noise suppressing a signal that was otherwise present — the unprotected, raw view would already have contained none to suppress. This is also the point at which the ML Plane substrate (§3.1) is load-bearing for the experiment, not merely infrastructure: its event stream — local update produced, update privatized, round aggregated — is exactly what makes these three levels of aggregator privilege separately observable and separately attackable in the first place.</w:t>
-      </w:r>
-    </w:p>
-    <w:p>
-      <w:pPr>
-        <w:spacing w:after="160"/>
-        <w:jc w:val="both"/>
-      </w:pPr>
-      <w:r>
-        <w:rPr>
-          <w:b w:val="false"/>
-          <w:bCs w:val="false"/>
-          <w:i w:val="false"/>
-          <w:iCs w:val="false"/>
-        </w:rPr>
-        <w:t xml:space="preserve">A further caveat applies specifically to how ε should be read in this paper. The formal (ε,δ)-DP guarantee for a clip-and-noise mechanism holds cleanly when each client contributes one gradient step per round (as in DP-SGD); our clients instead run local_epochs=50 local optimizer steps per round before their update is clipped and noised once. At the client-level granularity these placements are calibrated to (the unit McMahan et al. protect, per §3.4 above), this does not weaken the guarantee: the clip bounds the per-round contribution of the whole client regardless of how many local steps produced it. We flag it nonetheless because it is easy to conflate with the record-level question this paper actually asks (whether LiRA can detect a single session): the 50-epoch local training regime described in §5 is what gives the model the opportunity to memorize a single session in the first place, and ε here is best read as an experimental noise parameter calibrated to the client-level unit, not as a formal per-record privacy budget.</w:t>
+        <w:t xml:space="preserve">3.4 ByzantineDetector: a formally separate integrity domain</w:t>
+      </w:r>
+    </w:p>
+    <w:p>
+      <w:pPr>
+        <w:spacing w:after="160"/>
+        <w:jc w:val="both"/>
+      </w:pPr>
+      <w:r>
+        <w:rPr>
+          <w:b w:val="false"/>
+          <w:bCs w:val="false"/>
+          <w:i w:val="false"/>
+          <w:iCs w:val="false"/>
+        </w:rPr>
+        <w:t xml:space="preserve">ByzantineDetector (Krum, cosine-similarity, CUSUM, gradient-explosion detection) protects FL convergence against Byzantine/poisoning clients — a client-side integrity concern (Scenario 2 in our threat model, §4). We state explicitly, having found and corrected our own earlier conflation of this point during development: no IDS mechanism provides any privacy guarantee against the honest-but-curious server this paper's MIA results are about. Integrity and privacy are two orthogonal domains in this architecture; ByzantineDetector is never cited here as an MIA defense, active or passive.</w:t>
       </w:r>
     </w:p>
     <w:p>
@@ -480,7 +508,61 @@
         <w:spacing w:after="120" w:before="220"/>
       </w:pPr>
       <w:r>
-        <w:t xml:space="preserve">3.5 LiRA: Adaptations to This Setting</w:t>
+        <w:t xml:space="preserve">3.5 Three Differential-Privacy Placements</w:t>
+      </w:r>
+    </w:p>
+    <w:p>
+      <w:pPr>
+        <w:spacing w:after="160"/>
+        <w:jc w:val="both"/>
+      </w:pPr>
+      <w:r>
+        <w:rPr>
+          <w:b w:val="false"/>
+          <w:bCs w:val="false"/>
+          <w:i w:val="false"/>
+          <w:iCs w:val="false"/>
+        </w:rPr>
+        <w:t xml:space="preserve">We evaluate three placements of client-update clipping and Gaussian noising relative to FedAvg aggregation: dp-fedavg (per-client clip + noise before aggregation — the server transiently observes the raw update, which is exactly what LiRA is built to attack); central (client-side clip only, a single aggregate-level noise draw post-FedAvg — matches McMahan et al.'s [3] Algorithm 1 literally; individual client contributions are never noised); and local (per-client clip + noise, with the raw update never transmitted to or observed by the server, not even transiently). Our own composition accounting across FL rounds is naive, not RDP-based (§9); the gap Jayaraman and Evans document between naive and tighter composition is exactly why our reported multi-round privacy budget should be read as a conservative upper bound, not a tight guarantee. All three placements clip and noise at client granularity: the unit of protection is a client's per-round contribution as a whole — the notion McMahan et al. [3] formalize as client-level DP — not per-example DP-SGD (Abadi et al. [7]), which instead bounds the influence of a single training record. LiRA targets exactly that finer granularity: it asks whether one specific charging session, inside one client's local training set, can be detected as a member. None of our three placements is calibrated to bound a single record's contribution to its client's local training, so client-level clipping provides no formal guarantee at the granularity LiRA actually attacks. Our result is therefore an empirical measurement of whether a record-level attacker finds detectable leakage under a client-level DP configuration, not a claim that client-level DP formally protects individual sessions — the same gap between theoretical guarantee and empirical attack surface that motivates this paper's central question (§1).</w:t>
+      </w:r>
+    </w:p>
+    <w:p>
+      <w:pPr>
+        <w:spacing w:after="160"/>
+        <w:jc w:val="both"/>
+      </w:pPr>
+      <w:r>
+        <w:rPr>
+          <w:b w:val="false"/>
+          <w:bCs w:val="false"/>
+          <w:i w:val="false"/>
+          <w:iCs w:val="false"/>
+        </w:rPr>
+        <w:t xml:space="preserve">Read this way, the three placements are not three independent privacy mechanisms but three points of adversary privilege along the same per-client update's transformation pipeline: dp-fedavg observes it raw, before any clipping or noising; central observes it after client-side clipping but before any noise; local observes only the final clipped-and-noised value — never the raw or intermediate one, not even transiently. Under this reading, dp-fedavg is not one privacy mechanism among three that happens to provide no protection: it is the ceiling of what is extractable from this channel at all, under the most privileged view our architecture ever grants an aggregator. Should that ceiling itself show no detectable membership signal (§7), the same null result under the two protective placements, central and local, cannot be attributed to DP noise suppressing a signal that was otherwise present — the unprotected, raw view would already have contained none to suppress. This is also the point at which the ML Plane substrate (§3.1) is load-bearing for the experiment, not merely infrastructure: its event stream — local update produced, update privatized, round aggregated — is exactly what makes these three levels of aggregator privilege separately observable and separately attackable in the first place.</w:t>
+      </w:r>
+    </w:p>
+    <w:p>
+      <w:pPr>
+        <w:spacing w:after="160"/>
+        <w:jc w:val="both"/>
+      </w:pPr>
+      <w:r>
+        <w:rPr>
+          <w:b w:val="false"/>
+          <w:bCs w:val="false"/>
+          <w:i w:val="false"/>
+          <w:iCs w:val="false"/>
+        </w:rPr>
+        <w:t xml:space="preserve">A further caveat applies specifically to how ε should be read in this paper. The formal (ε,δ)-DP guarantee for a clip-and-noise mechanism holds cleanly when each client contributes one gradient step per round (as in DP-SGD); our clients instead run local_epochs=50 local optimizer steps per round before their update is clipped and noised once. At the client-level granularity these placements are calibrated to (the unit McMahan et al. protect, per §3.5 above), this does not weaken the guarantee: the clip bounds the per-round contribution of the whole client regardless of how many local steps produced it. We flag it nonetheless because it is easy to conflate with the record-level question this paper actually asks (whether LiRA can detect a single session): the 50-epoch local training regime described in §5 is what gives the model the opportunity to memorize a single session in the first place, and ε here is best read as an experimental noise parameter calibrated to the client-level unit, not as a formal per-record privacy budget.</w:t>
+      </w:r>
+    </w:p>
+    <w:p>
+      <w:pPr>
+        <w:pStyle w:val="Heading2"/>
+        <w:spacing w:after="120" w:before="220"/>
+      </w:pPr>
+      <w:r>
+        <w:t xml:space="preserve">3.6 LiRA: Adaptations to This Setting</w:t>
       </w:r>
     </w:p>
     <w:p>
@@ -582,7 +664,7 @@
           <w:i w:val="false"/>
           <w:iCs w:val="false"/>
         </w:rPr>
-        <w:t xml:space="preserve">Scenario 2 (a malicious FL client) is not simply out of scope: as §3.3 argues, the ML Plane substrate has two consumers with orthogonal threat models over the same observability layer — the Privacy Auditor (confidentiality, Scenario 1, the subject of this paper’s results) and ByzantineDetector (integrity, Scenario 2). Scenario 2 belongs to that other consumer, is validated separately from the privacy claims in this paper, and is not conflated with Scenario 1 in our results. As of this submission, ByzantineDetector’s Krum/cosine-similarity/CUSUM mechanisms are implemented and unit-tested but have not yet been exercised end-to-end against an active Byzantine client on real FL training data — a gap we disclose explicitly rather than imply coverage we have not measured. Scenario 3 (compromised network gateway) and Scenario 4 (external passive eavesdropper, defeated by transport-layer security) remain genuinely out of scope: neither is an ML Plane consumer, and both are conventional network-security concerns orthogonal to Scenarios 1 and 2 alike.</w:t>
+        <w:t xml:space="preserve">Scenario 2 (a malicious FL client) is not simply out of scope: as §3.4 argues, the ML Plane substrate has two consumers with orthogonal threat models over the same observability layer — the Privacy Auditor (confidentiality, Scenario 1, the subject of this paper’s results) and ByzantineDetector (integrity, Scenario 2). Scenario 2 belongs to that other consumer, is validated separately from the privacy claims in this paper, and is not conflated with Scenario 1 in our results. As of this submission, ByzantineDetector’s Krum/cosine-similarity/CUSUM mechanisms are implemented and unit-tested but have not yet been exercised end-to-end against an active Byzantine client on real FL training data — a gap we disclose explicitly rather than imply coverage we have not measured. Scenario 3 (compromised network gateway) and Scenario 4 (external passive eavesdropper, defeated by transport-layer security) remain genuinely out of scope: neither is an ML Plane consumer, and both are conventional network-security concerns orthogonal to Scenarios 1 and 2 alike.</w:t>
       </w:r>
     </w:p>
     <w:p>
@@ -1231,7 +1313,7 @@
           <w:i w:val="false"/>
           <w:iCs w:val="false"/>
         </w:rPr>
-        <w:t xml:space="preserve">The two rows above come from two separate single-seed runs of the same protocol rather than one shared run, so they should not be read as a before/after comparison on identical canaries: run A additionally reports a calibrated LiRA AUC of 0.4863 / 0.6265 / 0.4250 (composed 0.5534), and run B reports a raw reconstruction-loss AUC of 0.6625 / 0.85 / 0.8375 — both broadly consistent with the table's figures, but we show the stronger single realization of each metric rather than averaging across runs we did not design to be pooled. Site coverage for the raw-loss signal is uneven, contrary to an earlier draft of this section that described it as holding at every site tested: at Office 1, raw reconstruction loss cleanly separates canary members from non-members in every round (as in the table). At Caltech, the same protocol produces an AUC of 0.3710 / 0.3805 / 0.4236 — inverted, below chance, not qualitatively similar separation. At JPL, raw-loss AUC is 0.4737 / 0.4632 / 0.4947 — at chance. The raw-loss positive control therefore succeeds unambiguously only at Office 1 among the three sites; we do not yet have an explanation for the sign flip at Caltech and report it as an open question rather than omit it. The calibrated LiRA score is more nuanced still. After fixing a shadow-sampling contamination bug (duplicate canary copies could previously fragment across a single shadow's IN/OUT split, diluting the differential signal LiRA's calibration relies on), calibrated LiRA on the Office 1 canaries (run B, ≈11% of that client's training set) detects the canary consistently across all three rounds (0.6375 / 0.6625 / 0.5875, composed 0.6875), above the 0.60 working threshold used in §6.1 — though, as elsewhere in this section, this is a single-seed/3-round result, not replicated across seeds. It remains systematically weaker than the raw-loss signal, which we attribute to a separate, still-open limitation: LiRA's Gaussian calibration operates at its per-shadow variance floor in 96–99% of cases in this run rather than on genuine per-shadow variance (§3.5, §9). Replicating the identical protocol at Caltech and JPL — where aggregate duplicate density is far lower (≈0.5% of local training data, since both clients have larger local datasets than Office 1) — does not reproduce the calibrated-LiRA signal (Caltech composed AUC 0.42–0.50; JPL composed AUC 0.5368). We attempted to isolate density from site by re-running the canary insertion at Caltech with aggregate duplicate density matched to Office 1's (≈10% of local training data, n_templates=84, n_duplicates=30): calibrated LiRA still failed to detect the canary (AUC 0.46–0.53, near or below chance). We had read this as evidence that duplicate density alone does not explain the Office 1/Caltech gap, but on closer inspection the two configurations do not match on the variable that plausibly drives memorization: Office 1 duplicates each of 5 templates 30× into a ≈1,680-session pool (≈2.0% per-record amplification), while the density-matched Caltech configuration duplicates each of 84 templates 30× into a ≈25,123-session pool (≈0.12% per-record amplification) — a 17× difference in per-record amplification despite matched aggregate density. Aggregate density and per-record amplification are not the same quantity, and the experiment as run confounds them; the Caltech result above should therefore be read as inconclusive on the density question, not as evidence against it. A cleaner test would hold n_templates=5 fixed (as at Office 1) and raise n_duplicates at Caltech until per-record amplification, rather than aggregate density, matches Office 1's; we did not have time to run this before submission and flag it as the natural next experiment. In every case this is a property of LiRA's calibration under an artificial near-duplicate-record design; natural EV sessions in our dataset are never literal duplicates of one another, so none of this extends to, or undermines, the null result in §7.</w:t>
+        <w:t xml:space="preserve">The two rows above come from two separate single-seed runs of the same protocol rather than one shared run, so they should not be read as a before/after comparison on identical canaries: run A additionally reports a calibrated LiRA AUC of 0.4863 / 0.6265 / 0.4250 (composed 0.5534), and run B reports a raw reconstruction-loss AUC of 0.6625 / 0.85 / 0.8375 — both broadly consistent with the table's figures, but we show the stronger single realization of each metric rather than averaging across runs we did not design to be pooled. Site coverage for the raw-loss signal is uneven, contrary to an earlier draft of this section that described it as holding at every site tested: at Office 1, raw reconstruction loss cleanly separates canary members from non-members in every round (as in the table). At Caltech, the same protocol produces an AUC of 0.3710 / 0.3805 / 0.4236 — inverted, below chance, not qualitatively similar separation. At JPL, raw-loss AUC is 0.4737 / 0.4632 / 0.4947 — at chance. The raw-loss positive control therefore succeeds unambiguously only at Office 1 among the three sites; we do not yet have an explanation for the sign flip at Caltech and report it as an open question rather than omit it. The calibrated LiRA score is more nuanced still. After fixing a shadow-sampling contamination bug (duplicate canary copies could previously fragment across a single shadow's IN/OUT split, diluting the differential signal LiRA's calibration relies on), calibrated LiRA on the Office 1 canaries (run B, ≈11% of that client's training set) detects the canary consistently across all three rounds (0.6375 / 0.6625 / 0.5875, composed 0.6875), above the 0.60 working threshold used in §6.1 — though, as elsewhere in this section, this is a single-seed/3-round result, not replicated across seeds. It remains systematically weaker than the raw-loss signal, which we attribute to a separate, still-open limitation: LiRA's Gaussian calibration operates at its per-shadow variance floor in 96–99% of cases in this run rather than on genuine per-shadow variance (§3.6, §9). Replicating the identical protocol at Caltech and JPL — where aggregate duplicate density is far lower (≈0.5% of local training data, since both clients have larger local datasets than Office 1) — does not reproduce the calibrated-LiRA signal (Caltech composed AUC 0.42–0.50; JPL composed AUC 0.5368). We attempted to isolate density from site by re-running the canary insertion at Caltech with aggregate duplicate density matched to Office 1's (≈10% of local training data, n_templates=84, n_duplicates=30): calibrated LiRA still failed to detect the canary (AUC 0.46–0.53, near or below chance). We had read this as evidence that duplicate density alone does not explain the Office 1/Caltech gap, but on closer inspection the two configurations do not match on the variable that plausibly drives memorization: Office 1 duplicates each of 5 templates 30× into a ≈1,680-session pool (≈2.0% per-record amplification), while the density-matched Caltech configuration duplicates each of 84 templates 30× into a ≈25,123-session pool (≈0.12% per-record amplification) — a 17× difference in per-record amplification despite matched aggregate density. Aggregate density and per-record amplification are not the same quantity, and the experiment as run confounds them; the Caltech result above should therefore be read as inconclusive on the density question, not as evidence against it. A cleaner test would hold n_templates=5 fixed (as at Office 1) and raise n_duplicates at Caltech until per-record amplification, rather than aggregate density, matches Office 1's; we did not have time to run this before submission and flag it as the natural next experiment. In every case this is a property of LiRA's calibration under an artificial near-duplicate-record design; natural EV sessions in our dataset are never literal duplicates of one another, so none of this extends to, or undermines, the null result in §7.</w:t>
       </w:r>
     </w:p>
     <w:p>
@@ -3302,7 +3384,7 @@
           <w:i w:val="false"/>
           <w:iCs w:val="false"/>
         </w:rPr>
-        <w:t xml:space="preserve">Every DP configuration increases mean reconstruction loss by roughly 240–290× over the no-DP baseline (0.0017), regardless of placement or ε, and is close to a non-functional model in absolute terms. This is a confound for the null result above: with a 570-parameter model and per-weight noise σ ranging from 4.84 (ε=1.0) to 48.4 (ε=0.1) (§3.4), it is plausible the model retains too little of the training signal for any attack — not just LiRA — to detect membership, rather than DP specifically neutralizing an attack that would otherwise succeed. The no-DP baseline in Table 2 (also indistinguishable from chance) is the strongest evidence against this alternative explanation: it shows the architecture itself does not memorize enough for LiRA to detect membership even with no noise at all, so the DP configurations' null results are not solely an artifact of utility destruction. We nonetheless report U_cost explicitly, rather than only the AUC null result, so this confound remains visible rather than implicit.</w:t>
+        <w:t xml:space="preserve">Every DP configuration increases mean reconstruction loss by roughly 240–290× over the no-DP baseline (0.0017), regardless of placement or ε, and is close to a non-functional model in absolute terms. This is a confound for the null result above: with a 570-parameter model and per-weight noise σ ranging from 4.84 (ε=1.0) to 48.4 (ε=0.1) (§3.5), it is plausible the model retains too little of the training signal for any attack — not just LiRA — to detect membership, rather than DP specifically neutralizing an attack that would otherwise succeed. The no-DP baseline in Table 2 (also indistinguishable from chance) is the strongest evidence against this alternative explanation: it shows the architecture itself does not memorize enough for LiRA to detect membership even with no noise at all, so the DP configurations' null results are not solely an artifact of utility destruction. We nonetheless report U_cost explicitly, rather than only the AUC null result, so this confound remains visible rather than implicit.</w:t>
       </w:r>
     </w:p>
     <w:p>
@@ -3658,7 +3740,7 @@
           <w:i w:val="false"/>
           <w:iCs w:val="false"/>
         </w:rPr>
-        <w:t xml:space="preserve">AGGIORNAMENTO 2026-09-14 (seconda nota, dopo una revisione esterna indipendente sull’intero paper e codice): la nota del 2026-09-08 sopra descrive i numeri della Tabella 2 come “DEFINITIVI”; questo non e' piu' accurato alla luce di tre correzioni successive documentate in questa sezione e in §3.5/§6: (1) il test di equivalenza TOST (Schuirmann 1987) sostituisce ora la lettura “fail-to-reject” del sign-test con n=5 (che non puo' raggiungere significatività per costruzione) con un test positivo di equivalenza al margine |AUC-0.5|&lt;0.02 — tutte le 10 configurazioni risultano equivalenti a 0.5 con questo criterio piu' rigoroso; (2) è stato introdotto un flag diagnostico opt-in (cfg["lira"]["floor_mode"], invariato di default) che disattiva il floor di varianza condiviso sigma_in/sigma_out per central — dove tale floor viene raggiunto nel 95–99% dei campioni — per verificare se il floor stesso stia mascherando un segnale reale (lira_debug_matched_formula_auc collassa a 0.21–0.34 su central pur con AUC composta vicina a 0.5); questa verifica richiede un run reale non ancora eseguito alla data di questa nota e i numeri di Tabella 2 per central vanno quindi letti come provvisori rispetto a questa verifica in corso; (3) scipy e' stato aggiunto alle dipendenze dichiarate del progetto (era gia' installato in questo ambiente, quindi il test di Wilcoxon citato sopra e' comunque quello reale, non il fallback). I numeri stessi di Tabella 2 restano quelli descritti nella nota del 2026-09-08; e' la parola “DEFINITIVI” che va ora intesa come “definitivi rispetto ai bug allora noti”, non rispetto a tutte le verifiche successive.</w:t>
+        <w:t xml:space="preserve">AGGIORNAMENTO 2026-09-14 (seconda nota, dopo una revisione esterna indipendente sull’intero paper e codice): la nota del 2026-09-08 sopra descrive i numeri della Tabella 2 come “DEFINITIVI”; questo non e' piu' accurato alla luce di tre correzioni successive documentate in questa sezione e in §3.6/§6: (1) il test di equivalenza TOST (Schuirmann 1987) sostituisce ora la lettura “fail-to-reject” del sign-test con n=5 (che non puo' raggiungere significatività per costruzione) con un test positivo di equivalenza al margine |AUC-0.5|&lt;0.02 — tutte le 10 configurazioni risultano equivalenti a 0.5 con questo criterio piu' rigoroso; (2) è stato introdotto un flag diagnostico opt-in (cfg["lira"]["floor_mode"], invariato di default) che disattiva il floor di varianza condiviso sigma_in/sigma_out per central — dove tale floor viene raggiunto nel 95–99% dei campioni — per verificare se il floor stesso stia mascherando un segnale reale (lira_debug_matched_formula_auc collassa a 0.21–0.34 su central pur con AUC composta vicina a 0.5); questa verifica richiede un run reale non ancora eseguito alla data di questa nota e i numeri di Tabella 2 per central vanno quindi letti come provvisori rispetto a questa verifica in corso; (3) scipy e' stato aggiunto alle dipendenze dichiarate del progetto (era gia' installato in questo ambiente, quindi il test di Wilcoxon citato sopra e' comunque quello reale, non il fallback). I numeri stessi di Tabella 2 restano quelli descritti nella nota del 2026-09-08; e' la parola “DEFINITIVI” che va ora intesa come “definitivi rispetto ai bug allora noti”, non rispetto a tutte le verifiche successive.</w:t>
       </w:r>
     </w:p>
     <w:p>
@@ -3816,7 +3898,7 @@
         <w:spacing w:after="90"/>
       </w:pPr>
       <w:r>
-        <w:t xml:space="preserve">Fixed-threshold gradient clipping only; the DP comparison is across placement (dp-fedavg/central/local), not across clipping strategy — adaptive/percentile-based clipping is future work. Client-level clipping only (§3.4): none of the three placements bounds a single record's contribution the way per-example DP-SGD does; implementing and evaluating true per-example DP-SGD as a fourth placement is future work.</w:t>
+        <w:t xml:space="preserve">Fixed-threshold gradient clipping only; the DP comparison is across placement (dp-fedavg/central/local), not across clipping strategy — adaptive/percentile-based clipping is future work. Client-level clipping only (§3.5): none of the three placements bounds a single record's contribution the way per-example DP-SGD does; implementing and evaluating true per-example DP-SGD as a fourth placement is future work.</w:t>
       </w:r>
     </w:p>
     <w:p>
@@ -3855,7 +3937,7 @@
         <w:spacing w:after="90"/>
       </w:pPr>
       <w:r>
-        <w:t xml:space="preserve">Composition across FL rounds is naive (ε_total = ε_per_round × rounds), not Rényi DP (RDP) or zCDP — a real gap: Jayaraman and Evans [14] show naive composition needs 50× the budget RDP needs for matched utility on a comparable task (§2), so our reported multi-round ε is a conservative (loose) upper bound, not a tight guarantee. This does not affect the MIA measurements themselves, which are empirical and independent of the composition bound used to state the theoretical budget. We additionally implemented the closed-form advanced-composition bound (Dwork and Roth [6], Theorem 3.20) and computed it for every completed experiment (epsilon_cumulative_advanced, scripts/compute_advanced_composition.py): at the T=10 rounds used throughout this campaign it is never tighter than the naive bound above — advanced composition is a large-round/small-ε asymptotic improvement that needs far more rounds than we run (analytically: ≥29 rounds at ε=0.1, ≥187 at ε=0.5, and never at ε=1.0, since ε ≥ ln(2)≈0.693 rules out any finite-round crossover). An RDP accountant specific to the Gaussian mechanism remains the more promising path to a tighter number and is not implemented — future work. Results are validated on real ACN-Data in both simulation and a real deployment; the full 5-seed × 10-configuration bootstrap campaign (§7) is complete, including the two configurations (central/local, ε=0.5) missing from the earlier 8-configuration run. A true Wilcoxon signed-rank test was run on a machine with scipy: none of the 10 configuration groups shows AUC significantly different from 0.5 (p ranging 0.3125–1.0000, all far above 0.05). Two real data-conflation bugs were found and fixed during this process: first (2026-09-04), the "no-DP baseline" group had silently included files from an unrelated robustness experiment (entity-aware train/holdout split) alongside its own real seeds, inflating n from 5 to 10; second (2026-09-08), the campaign’s own reruns — which reused the same 5 seeds to add previously-missing metrics rather than to add statistical power — were counted as additional independent observations instead of replacements, inflating n to 10 or 15 depending on configuration, and for “central” specifically mixing pre-fix data (before a DP-sensitivity correction, see §3.4) with corrected post-fix data. Both are fixed via deduplication by (configuration, seed), keeping only the most recent file per seed; all 10 groups now correctly show n=5. TPR@low-FPR is present in every result file of this final campaign (the field was implemented after the earlier, superseded 8-configuration run had already started, which is why that run lacked it), and — per Carlini et al.'s [2] own argument that AUC-ROC can hide a low-FPR signal — has now been bootstrap/Wilcoxon-tested at FPR ∈ {0.1%, 1%, 5%} (§7), with the same null result as the AUC-ROC analysis.</w:t>
+        <w:t xml:space="preserve">Composition across FL rounds is naive (ε_total = ε_per_round × rounds), not Rényi DP (RDP) or zCDP — a real gap: Jayaraman and Evans [14] show naive composition needs 50× the budget RDP needs for matched utility on a comparable task (§2), so our reported multi-round ε is a conservative (loose) upper bound, not a tight guarantee. This does not affect the MIA measurements themselves, which are empirical and independent of the composition bound used to state the theoretical budget. We additionally implemented the closed-form advanced-composition bound (Dwork and Roth [6], Theorem 3.20) and computed it for every completed experiment (epsilon_cumulative_advanced, scripts/compute_advanced_composition.py): at the T=10 rounds used throughout this campaign it is never tighter than the naive bound above — advanced composition is a large-round/small-ε asymptotic improvement that needs far more rounds than we run (analytically: ≥29 rounds at ε=0.1, ≥187 at ε=0.5, and never at ε=1.0, since ε ≥ ln(2)≈0.693 rules out any finite-round crossover). An RDP accountant specific to the Gaussian mechanism remains the more promising path to a tighter number and is not implemented — future work. Results are validated on real ACN-Data in both simulation and a real deployment; the full 5-seed × 10-configuration bootstrap campaign (§7) is complete, including the two configurations (central/local, ε=0.5) missing from the earlier 8-configuration run. A true Wilcoxon signed-rank test was run on a machine with scipy: none of the 10 configuration groups shows AUC significantly different from 0.5 (p ranging 0.3125–1.0000, all far above 0.05). Two real data-conflation bugs were found and fixed during this process: first (2026-09-04), the "no-DP baseline" group had silently included files from an unrelated robustness experiment (entity-aware train/holdout split) alongside its own real seeds, inflating n from 5 to 10; second (2026-09-08), the campaign’s own reruns — which reused the same 5 seeds to add previously-missing metrics rather than to add statistical power — were counted as additional independent observations instead of replacements, inflating n to 10 or 15 depending on configuration, and for “central” specifically mixing pre-fix data (before a DP-sensitivity correction, see §3.5) with corrected post-fix data. Both are fixed via deduplication by (configuration, seed), keeping only the most recent file per seed; all 10 groups now correctly show n=5. TPR@low-FPR is present in every result file of this final campaign (the field was implemented after the earlier, superseded 8-configuration run had already started, which is why that run lacked it), and — per Carlini et al.'s [2] own argument that AUC-ROC can hide a low-FPR signal — has now been bootstrap/Wilcoxon-tested at FPR ∈ {0.1%, 1%, 5%} (§7), with the same null result as the AUC-ROC analysis.</w:t>
       </w:r>
     </w:p>
     <w:p>
@@ -4227,6 +4309,66 @@
           <w:iCs w:val="false"/>
         </w:rPr>
         <w:t xml:space="preserve">[15] M. A. Rahman, T. Rahman, R. Laganière, N. Mohammed, and Y. Wang, "Membership Inference Attack against Differentially Private Deep Learning Model," Transactions on Data Privacy, vol. 11, no. 1, pp. 61–79, 2018.</w:t>
+      </w:r>
+    </w:p>
+    <w:p>
+      <w:pPr>
+        <w:spacing w:after="160"/>
+        <w:jc w:val="left"/>
+      </w:pPr>
+      <w:r>
+        <w:rPr>
+          <w:b w:val="false"/>
+          <w:bCs w:val="false"/>
+          <w:i w:val="false"/>
+          <w:iCs w:val="false"/>
+        </w:rPr>
+        <w:t xml:space="preserve">[16] M. Jagielski, J. Ullman, and A. Oprea, "Auditing Differentially Private Machine Learning: How Private is Private SGD?," NeurIPS, 2020.</w:t>
+      </w:r>
+    </w:p>
+    <w:p>
+      <w:pPr>
+        <w:spacing w:after="160"/>
+        <w:jc w:val="left"/>
+      </w:pPr>
+      <w:r>
+        <w:rPr>
+          <w:b w:val="false"/>
+          <w:bCs w:val="false"/>
+          <w:i w:val="false"/>
+          <w:iCs w:val="false"/>
+        </w:rPr>
+        <w:t xml:space="preserve">[17] M. Nasr, S. Song, A. Thakurta, N. Papernot, and N. Carlini, "Adversary Instantiation: Lower Bounds for Differentially Private Machine Learning," IEEE S&amp;P, 2021.</w:t>
+      </w:r>
+    </w:p>
+    <w:p>
+      <w:pPr>
+        <w:spacing w:after="160"/>
+        <w:jc w:val="left"/>
+      </w:pPr>
+      <w:r>
+        <w:rPr>
+          <w:b w:val="false"/>
+          <w:bCs w:val="false"/>
+          <w:i w:val="false"/>
+          <w:iCs w:val="false"/>
+        </w:rPr>
+        <w:t xml:space="preserve">[18] T. Steinke, M. Nasr, and M. Jagielski, "Privacy Auditing with One (1) Training Run," NeurIPS, 2023.</w:t>
+      </w:r>
+    </w:p>
+    <w:p>
+      <w:pPr>
+        <w:spacing w:after="160"/>
+        <w:jc w:val="left"/>
+      </w:pPr>
+      <w:r>
+        <w:rPr>
+          <w:b w:val="false"/>
+          <w:bCs w:val="false"/>
+          <w:i w:val="false"/>
+          <w:iCs w:val="false"/>
+        </w:rPr>
+        <w:t xml:space="preserve">[19] S. Maddock, A. Sablayrolles, and P. Stock, "CANIFE: Crafting Canaries for Empirical Privacy Measurement in Federated Learning," ICLR, 2023.</w:t>
       </w:r>
     </w:p>
     <w:p>

</xml_diff>

<commit_message>
Sprint 10zz+104: argomento causalita/confinamento/fedelta per validita offline in §3.3 (EN+IT); D1 corretto (Auditor: budget accounting, non leakage detection) con verifica empirica sui run canary esistenti
</commit_message>
<xml_diff>
--- a/docs/paper/ChargeShield-FL_DSN2027_paper_skeleton.docx
+++ b/docs/paper/ChargeShield-FL_DSN2027_paper_skeleton.docx
@@ -378,6 +378,21 @@
     </w:p>
     <w:p>
       <w:pPr>
+        <w:spacing w:after="160"/>
+        <w:jc w:val="both"/>
+      </w:pPr>
+      <w:r>
+        <w:rPr>
+          <w:b w:val="false"/>
+          <w:bCs w:val="false"/>
+          <w:i w:val="false"/>
+          <w:iCs w:val="false"/>
+        </w:rPr>
+        <w:t xml:space="preserve">Two terms in this section could easily be conflated, so we fix them once here: “budget auditing” refers to the Privacy Auditor (§3.2), an online, runtime component that tracks DP budget consumption and flags threshold-based anomalies as training happens; “empirical privacy auditing” refers to the offline suite of adversary-instantiated attacks (Yeom, Shadow, LiRA — §3.3) that measures, after training, what a concrete adversary actually extracts from the same round data. The two are architecturally independent and answer different questions — one tracks a promise, the other measures what was actually extracted — and every subsequent use of “auditor”/“auditing” in this paper follows this distinction.</w:t>
+      </w:r>
+    </w:p>
+    <w:p>
+      <w:pPr>
         <w:pStyle w:val="Heading2"/>
         <w:spacing w:after="120" w:before="220"/>
       </w:pPr>
@@ -446,6 +461,21 @@
           <w:iCs w:val="false"/>
         </w:rPr>
         <w:t xml:space="preserve">Differential privacy’s (ε,δ) guarantee bounds worst-case leakage over every possible adversary and neighboring dataset; it does not by itself say what a concrete, realistic adversary actually extracts from one specific trained model. A distinct methodology — empirically instantiating one or more concrete membership-inference adversaries against a real model and measuring what they achieve, rather than reasoning about the DP game in the abstract — is what Jagielski et al. [16] and Nasr et al. [17] call adversary instantiation. This is precisely the role Yeom, Shadow, and LiRA (§3.6) play in this paper: three adversary instantiations of increasing strength — a raw-loss threshold, a single calibrated shadow model, and an ensemble likelihood-ratio test — run offline against real per-round training data (§5–§7), entirely separate from the Privacy Auditor’s (§3.2) online budget accounting. We keep this distinction terminologically explicit because the DP-auditing literature’s own use of “auditor” [16–18] refers to this adversary/measurement role, not to our Privacy Auditor component: the Privacy Auditor computes what the DP mechanism promises; Yeom/Shadow/LiRA measure what an instantiated adversary actually extracts. We use “empirical auditing of differential privacy” for this section’s methodology throughout, reserving “the Privacy Auditor” exclusively for the defensive telemetry subsystem of §3.2.</w:t>
+      </w:r>
+    </w:p>
+    <w:p>
+      <w:pPr>
+        <w:spacing w:after="160"/>
+        <w:jc w:val="both"/>
+      </w:pPr>
+      <w:r>
+        <w:rPr>
+          <w:b w:val="false"/>
+          <w:bCs w:val="false"/>
+          <w:i w:val="false"/>
+          <w:iCs w:val="false"/>
+        </w:rPr>
+        <w:t xml:space="preserve">Running these attacks after training rather than inside the server process does not by itself weaken what the measurement can support, provided three conditions hold — each worth declaring explicitly, since this is the first thing a reviewer will scrutinize about an offline analysis of this kind. First, causality: the attack scored at round t uses only artifacts from rounds ≤ t. In our implementation, shadow models are warm-started from that same round's own global weights (§3.6) and the composed score accumulates forward across rounds, never backward — true by construction of the round loop, but worth stating rather than left for a reader to infer from the code. Second, informational confinement: the attack uses only what the server legitimately receives — member/non-member labels are used by the evaluator to compute AUC-ROC after scoring, never by the attacker to produce the scores themselves. This is standard practice in the MIA literature, but is worth stating explicitly here precisely because the attacker/evaluator separation is no longer visually obvious once the attack runs after the fact rather than inline. Third, dump fidelity: on the NVFLARE deployment path, the pickle ChargeShieldAggregator exports after each round contains exactly what the aggregator held in memory, with no loss or rounding — a condition specific to that path, since the single-process simulation never serializes round_data to begin with; it is passed in memory to the same attack code within the same process. With these three conditions declared and verified, offline evaluation is not merely a defensible compromise but has two properties worth claiming rather than excusing. Reproducibility: the round_data artifact — in-memory for the simulation, the pickle dump for NVFLARE — can be re-attacked by anyone with a different attack than ours, which artifact evaluation rewards directly. Non-interference: running an attack inside the aggregator's own aggregation step would perturb its timing and memory footprint, and on NVFLARE potentially the aggregation itself; keeping the measurement offline guarantees it cannot alter what it measures. The one claim offline evaluation cannot support is any runtime detection of privacy risk as training happens — which is consistent with, not a limitation of, this architecture: the only component that ever operates online is the Privacy Auditor (§3.2), and it performs budget accounting, not attack.</w:t>
       </w:r>
     </w:p>
     <w:p>

</xml_diff>